<commit_message>
Auto commit (2026-10-06 17:12) — 2 changes
Claude Code 세션 종료 시 자동 커밋.

Co-Authored-By: Claude <noreply@anthropic.com>
</commit_message>
<xml_diff>
--- a/projects/리메이크 러프 기획안 11종_v2.docx
+++ b/projects/리메이크 러프 기획안 11종_v2.docx
@@ -204,7 +204,7 @@
           <w:color w:val="6B6B6B"/>
           <w:sz w:val="21"/>
         </w:rPr>
-        <w:t xml:space="preserve">06  세트 B · 크리스마스 판타지 · 겨울 용 왕국  </w:t>
+        <w:t xml:space="preserve">06  세트 B · 크리스마스 판타지  </w:t>
       </w:r>
       <w:r>
         <w:rPr>
@@ -3690,7 +3690,7 @@
           <w:color w:val="6B6B6B"/>
           <w:sz w:val="18"/>
         </w:rPr>
-        <w:t>06 · 원작 NetShort &lt;I Spoke Baby Dragon and Won Everyone Over!&gt; · 세트 B (크리스마스 판타지 · 겨울 용 왕국)</w:t>
+        <w:t>06 · 원작 NetShort &lt;I Spoke Baby Dragon and Won Everyone Over!&gt; · 세트 B (크리스마스 판타지)</w:t>
       </w:r>
     </w:p>
     <w:p>
@@ -4032,7 +4032,7 @@
           <w:b w:val="0"/>
           <w:sz w:val="21"/>
         </w:rPr>
-        <w:t>유모들이 배고파 그렇다며 젖병을 물리는 순간, 등에 바늘이 박혔다는 아기 목소리가 들린다. 머리를 다친 뒤 케이티에게만 세 살 미만 아기 말이 들린다. 케이티가 막아서자 마거릿은 인간이 아기 용 말을 알아듣냐고 비웃고, 왕자 몸에 손대면 끝장이라고 경고한다. 케이티는 담요 속에 손을 넣어 등을 찌르던 브로치를 뽑아내고, 헨리가 들어선다. 「누가 내 동생 몸에 손대라고 했지?」 오늘 받은 증표부터 빼앗겠다는 헨리에게, 올리의 피 묻은 손으로 케이티가 답한다. 「증표 가져가요. 피부터 멈추고요.」</w:t>
+        <w:t>유모들이 배고파 그렇다며 젖병을 물리는 순간, 등에 바늘이 박혔다는 아기 목소리가 들린다. 머리를 다친 뒤 케이티에게만 세 살 미만 아기 말이 들린다. 케이티가 막아서자 마거릿은 인간이 아기 용 말을 알아듣냐고 비웃고, 왕자 몸에 손대면 끝장이라고 경고한다. 케이티는 담요 속에 손을 넣어 등을 찌르던 브로치를 뽑아내고, 헨리가 들어선다. 「누가 내 동생 몸에 손대라고 했지?」 오늘 받은 증표부터 빼앗겠다는 헨리에게, 피 묻은 손으로 케이티가 답한다. 「증표 가져가요. 피부터 멈추고요.」</w:t>
       </w:r>
     </w:p>
     <w:p>
@@ -4147,7 +4147,7 @@
           <w:b w:val="0"/>
           <w:sz w:val="21"/>
         </w:rPr>
-        <w:t>그날 밤 올리는 자고 나면 형이 또 도망간다며 잠을 버틴다. 마거릿은 잠 물약을 먹이라고 하지만, 케이티는 열 달 된 아기에게 약은 안 된다며 모두를 내보낸다. 케이티는 밤마다 성벽 순찰을 나가며 아기방 문을 잠그는 헨리에게, 폭풍 속으로 날아간 엄마 아빠가 돌아오지 않았듯 깰 때마다 아무도 없으니 잠이 무서운 거라고 말한다. 오늘 밤을 빼먹으면 올리가 다시는 형을 안 믿을 거라는 말에 30분만 곁에 있게 된 헨리는, 동화 대신 올겨울 세금이 은화 27만 닢, 새 기사가 3천 명이라는 장부를 읽어 준다. 잠든 올리가 형이 아직 있다고 웅얼거리는 말은 케이티만 듣고, 케이티는 올리가 기억할 건 형이 거둔 세금이 아니라 무서울 때 와 줬는지라고 말한다.</w:t>
+        <w:t>그날 밤 올리는 자고 나면 형이 또 도망간다며 잠을 버틴다. 마거릿은 잠 물약을 먹이라고 하지만, 케이티는 열 달 된 아기에게 약은 안 된다며 모두를 내보낸다. 케이티는 밤마다 성벽 순찰을 나가며 아기방 문을 잠그는 헨리에게, 폭풍 속으로 날아간 엄마 아빠가 돌아오지 않았듯 깰 때마다 아무도 없으니 잠이 무서운 거라고 말한다. 오늘 밤을 빼먹으면 올리가 다시는 형을 안 믿을 거라는 말에 30분만 곁에 있게 된 헨리는, 동화 대신 올겨울 세금이 은화 27만 닢, 새 기사가 3천 명이라는 장부를 읽어 준다. 잠든 올리가 형이 아직 있다고 웅얼거리는 말은 케이티만 듣고, 케이티는 올리가 기억할 건 형이 거둔 세금이 아니라 무서울 때 와 준 형이라고 말한다.</w:t>
       </w:r>
     </w:p>
     <w:p>

</xml_diff>

<commit_message>
Auto commit (2026-10-06 18:47) — 3 changes
Claude Code 세션 종료 시 자동 커밋.

Co-Authored-By: Claude <noreply@anthropic.com>
Claude-Session: https://claude.ai/code/b8b53fcb-f8d6-4d92-a3e9-a236c8db2489
</commit_message>
<xml_diff>
--- a/projects/리메이크 러프 기획안 11종_v2.docx
+++ b/projects/리메이크 러프 기획안 11종_v2.docx
@@ -265,7 +265,7 @@
           <w:color w:val="6B6B6B"/>
           <w:sz w:val="21"/>
         </w:rPr>
-        <w:t xml:space="preserve">08  세트 B · 하이틴 · 늑대인간 성채 아카데미  </w:t>
+        <w:t xml:space="preserve">08  세트 B · 오빠들 · 늑대인간 왕궁 팩  </w:t>
       </w:r>
       <w:r>
         <w:rPr>
@@ -273,7 +273,7 @@
           <w:b/>
           <w:sz w:val="21"/>
         </w:rPr>
-        <w:t>Rejected at Moon Academy</w:t>
+        <w:t>My Brothers and My Mate Chose Her</w:t>
       </w:r>
     </w:p>
     <w:p>
@@ -303,7 +303,7 @@
           <w:color w:val="6B6B6B"/>
           <w:sz w:val="21"/>
         </w:rPr>
-        <w:t xml:space="preserve">09  세트 A · 크리스마스 판타지  </w:t>
+        <w:t xml:space="preserve">09  세트 A · 용의 피 왕가  </w:t>
       </w:r>
       <w:r>
         <w:rPr>
@@ -311,7 +311,7 @@
           <w:b/>
           <w:sz w:val="21"/>
         </w:rPr>
-        <w:t>The Crown Prince's Christmas Son</w:t>
+        <w:t>The Dragon Heir's Secret Son</w:t>
       </w:r>
     </w:p>
     <w:p>
@@ -1989,7 +1989,7 @@
           <w:b w:val="0"/>
           <w:sz w:val="21"/>
         </w:rPr>
-        <w:t>소문난 바람둥이 체이스는 빙판 위에서 몰리의 카메라를 향해 자기 사진이나 잘 찍으라고 웃는다. 몰리는 그 바람둥이를 질색하지만, 체이스가 라이벌의 여자 친구인 자기에게 반해 있다는 건 모른다. 체이스가 몰리에게 한눈판 사이 타일러가 퍽을 빼앗아 골을 넣고, 베어스가 첫 경기를 이긴다. 크리스마스 선물로 만든 커플 앨범을 안고 라커룸 문을 연 몰리는, 웃통 벗은 타일러에게 룸메이트 브리트니가 매달려 있는 걸 본다. 「너, 내 룸메이트랑 바람피운 거야?」</w:t>
+        <w:t>소문난 바람둥이 체이스는 빙판 위에서 몰리의 카메라를 향해 자기 사진이나 잘 찍으라고 웃는다. 몰리는 그 바람둥이를 질색하고, 체이스는 속으로 웃는다. 「날 엄청 싫어하는데, 문제는 완전 내 스타일이라는 거.」 체이스가 자기에게 반해 있다는 걸 몰리는 모른다. 체이스가 몰리에게 한눈판 사이 타일러가 퍽을 빼앗아 골을 넣고, 베어스가 첫 경기를 이긴다. 크리스마스 선물로 만든 커플 앨범을 안고 라커룸 문을 연 몰리는, 웃통 벗은 타일러에게 룸메이트 브리트니가 매달려 있는 걸 본다. 「너, 내 룸메이트랑 바람피운 거야?」</w:t>
       </w:r>
     </w:p>
     <w:p>
@@ -2032,7 +2032,7 @@
           <w:b w:val="0"/>
           <w:sz w:val="21"/>
         </w:rPr>
-        <w:t>경기장 옥상으로 도망친 몰리가 그런 바람둥이 때문에 학교까지 옮겼다고 울자, 그 말을 다 들은 체이스가 나타난다. 왜 우냐는 체이스에게 몰리는 친구가 침대에서 자기보다 낫다더라고 쏘아붙인다. 몰리의 앨범을 빼앗아 넘기던 체이스는 자기 사진을 찾아내고는, 카메라 뒤에서 자기를 보고 있었냐고 웃는다. 몰리는 체이스가 경기 내내 자기를 보고 있었다는 걸 모른다. 타일러가 첫사랑이었다고 털어놓던 몰리는, 웃통이라도 벗어 줄까 묻는 체이스에게 싫다며 돌아선다. 그 순간 몰리가 얼음판에 미끄러지고, 체이스가 몰리를 부르며 달려온다.</w:t>
+        <w:t>경기장 옥상으로 도망친 몰리가 그런 바람둥이 때문에 학교까지 옮겼다고 울자, 그 말을 다 들은 체이스가 나타난다. 왜 우냐는 체이스에게 몰리가 쏘아붙인다. 「그렇게 알고 싶어? 내 룸메이트가 나보다 침대에서 더 낫대.」 몰리의 앨범을 빼앗아 넘기던 체이스는 자기 사진을 찾아내고는, 카메라 뒤에서 자기를 보고 있었냐고 웃는다. 몰리는 체이스가 경기 내내 자기를 보고 있었다는 걸 모른다. 타일러가 첫사랑이었다고 털어놓던 몰리는, 웃통이라도 벗어 줄까 묻는 체이스에게 싫다며 돌아선다. 그 순간 몰리가 얼음판에 미끄러지고, 체이스가 몰리를 부르며 달려온다.</w:t>
       </w:r>
     </w:p>
     <w:p>
@@ -2061,7 +2061,7 @@
           <w:b w:val="0"/>
           <w:sz w:val="21"/>
         </w:rPr>
-        <w:t>몰리가 눈을 뜬 곳은 체이스의 집 침대이고, 몰리는 체이스의 셔츠를 입고 있다. 체이스는 몰리가 머리를 부딪치고 녹은 눈 웅덩이에서 거의 헤엄치고 있어서 셔츠를 줬다며, 훔쳐보진 않았다고, 많이는 안 봤다고 능청을 떤다. 몰리는 작년 크리스마스에 체이스가 타일러 차인 줄 알고 선물 포장지로 칭칭 감아 놓은 차가 자기 차였다고 쏘아붙인다.</w:t>
+        <w:t>몰리가 눈을 뜬 곳은 체이스의 집 침대이고, 몰리는 체이스의 셔츠를 입고 있다. 「진정해. 네 신장 빼 간 거 아니니까.」 체이스는 몰리가 머리를 부딪치고 녹은 눈 웅덩이에서 거의 헤엄치고 있어서 셔츠를 줬다며, 훔쳐보진 않았다고, 많이는 안 봤다고 능청을 떤다. 몰리는 작년 크리스마스에 체이스가 타일러 차인 줄 알고 선물 포장지로 칭칭 감아 놓은 차가 자기 차였다고 쏘아붙인다.</w:t>
       </w:r>
     </w:p>
     <w:p>
@@ -2319,7 +2319,7 @@
           <w:b w:val="0"/>
           <w:sz w:val="21"/>
         </w:rPr>
-        <w:t>브리트니는 수천 명 앞에서 망신당한 것도 모자라 진짜 체이스 여자 친구라도 된 줄 아냐고 비웃는다. 몰리가 파티까지 와서 시비 거는 쪽이 더 없어 보인다고 받아치자 램스 선수들이 환호한다. 그러자 타일러가 끼어들어, 둘이 진짜 잤다면 체이스가 불쌍하다고, 몰리는 잠자리에서 불가사리처럼 누워만 있다고 떠벌린다. 컵을 쥔 몰리의 손이 떨리는 순간, 체이스는 직접 겪어 본 자기는 전혀 모르겠다며 문제는 타일러 아니냐고, 거기 제대로 작동은 하냐고 묻는다. 말조심하라는 타일러 앞에서 체이스는 몰리의 엉덩이를 찰싹 때리고, 이제 방 좀 찾으러 가겠다며 몰리를 데리고 나간다.</w:t>
+        <w:t>브리트니는 수천 명 앞에서 망신당한 것도 모자라 진짜 체이스 여자 친구라도 된 줄 아냐고 비웃는다. 몰리가 받아친다. 「진짜 없어 보이는 건 파티까지 와서 나한테 시비 거는 너야.」 램스 선수들이 환호한다. 그러자 타일러가 끼어들어, 둘이 진짜 잤다면 체이스가 불쌍하다고, 몰리는 잠자리에서 불가사리처럼 누워만 있다고 떠벌린다. 몰리가 속으로 이를 간다. 「내 손으로 저 자식 죽여 버릴 거야.」 그 순간 체이스는 직접 겪어 본 자기는 전혀 모르겠다며 문제는 타일러 아니냐고, 거기 제대로 작동은 하냐고 묻는다. 말조심하라는 타일러 앞에서 체이스는 몰리의 엉덩이를 찰싹 때리고, 이제 방 좀 찾으러 가겠다며 몰리를 데리고 나간다.</w:t>
       </w:r>
     </w:p>
     <w:p>
@@ -2333,7 +2333,7 @@
           <w:b w:val="0"/>
           <w:sz w:val="21"/>
         </w:rPr>
-        <w:t>침실 문이 닫히자 몰리는 타일러 입을 완전히 다물게 했다고 웃는다. 문 밖까지 따라온 타일러는 저건 다 쇼고 들어가서 아무것도 안 할 거라고 중얼거린다. 체이스는 이제 제대로 보여 줄 차례라며 몰리 앞으로 다가서고, 뭘 보여 주냐는 몰리의 물음에 낮게 답한다. 「진짜처럼.」</w:t>
+        <w:t>침실 문이 닫히자 몰리가 체이스를 노려본다. 「또 엉덩이 때리면 진짜 가만 안 둬.」 「좋았으면서.」 몰리는 타일러 입을 다물게 했다고 웃는다. 문 밖까지 따라온 타일러는 저건 다 쇼고 들어가서 아무것도 안 할 거라고 중얼거린다. 체이스는 이제 제대로 보여 줄 차례라며 몰리 앞으로 다가서고, 뭘 보여 주냐는 몰리의 물음에 낮게 답한다. 「진짜처럼.」</w:t>
       </w:r>
     </w:p>
     <w:p>
@@ -2703,7 +2703,7 @@
           <w:b w:val="0"/>
           <w:sz w:val="21"/>
         </w:rPr>
-        <w:t>소문난 바람둥이 닉은 빙판 위에서 해나의 카메라를 향해 자기 사진이나 잘 찍으라고 웃는다. 해나는 그 바람둥이를 질색하지만, 닉이 라이벌의 여자 친구인 자기에게 반해 있다는 건 모른다. 닉이 한눈판 사이 데릭이 퍽을 빼앗아 골을 넣고, 불독스가 첫 경기를 이긴다. 기념일 선물로 만든 앨범을 안고 라커룸 문을 연 해나는, 웃통 벗은 데릭에게 매달린 의붓언니이자 룸메이트 애슐리를 본다. 「너, 우리 언니랑 바람피운 거야?」</w:t>
+        <w:t>소문난 바람둥이 닉은 빙판 위에서 해나의 카메라를 향해 자기 사진이나 잘 찍으라고 웃는다. 해나는 그 바람둥이를 질색하고, 닉은 속으로 웃는다. 「날 엄청 싫어하는데, 문제는 완전 내 스타일이라는 거.」 닉이 자기에게 반해 있다는 걸 해나는 모른다. 닉이 해나에게 한눈판 사이 데릭이 퍽을 빼앗아 골을 넣고, 불독스가 첫 경기를 이긴다. 기념일 선물로 만든 앨범을 안고 라커룸 문을 연 해나는, 웃통 벗은 데릭에게 매달린 의붓언니이자 룸메이트 애슐리를 본다. 「너, 우리 언니랑 바람피운 거야?」</w:t>
       </w:r>
     </w:p>
     <w:p>
@@ -2746,7 +2746,7 @@
           <w:b w:val="0"/>
           <w:sz w:val="21"/>
         </w:rPr>
-        <w:t>옥상으로 도망친 해나가 데릭과 오빠들 때문에 학교까지 옮겼다고 울자, 그 말을 다 들은 닉이 나타난다. 왜 우냐는 닉에게 해나는 언니가 침대에서 자기보다 낫다더라고 쏘아붙인다. 해나의 앨범을 빼앗아 넘기던 닉은 자기 사진을 찾아내고는, 카메라 뒤에서 자기를 보고 있었냐고 웃는다. 데릭이 첫사랑이었다고 털어놓던 해나는 웃통이라도 벗어 줄까 묻는 닉에게 싫다며 돌아서다 미끄러지고, 닉이 해나를 부르며 달려온다.</w:t>
+        <w:t>옥상으로 도망친 해나가 데릭과 오빠들 때문에 학교까지 옮겼다고 울자, 그 말을 다 들은 닉이 나타난다. 왜 우냐는 닉에게 해나가 쏘아붙인다. 「그렇게 알고 싶어? 우리 언니가 나보다 침대에서 더 낫대.」 해나의 앨범을 빼앗아 넘기던 닉은 자기 사진을 찾아내고는, 카메라 뒤에서 자기를 보고 있었냐고 웃는다. 데릭이 첫사랑이었다고 털어놓던 해나는 웃통이라도 벗어 줄까 묻는 닉에게 싫다며 돌아서다 미끄러지고, 닉이 해나를 부르며 달려온다.</w:t>
       </w:r>
     </w:p>
     <w:p>
@@ -2775,7 +2775,7 @@
           <w:b w:val="0"/>
           <w:sz w:val="21"/>
         </w:rPr>
-        <w:t>해나가 눈을 뜬 곳은 닉의 집 침대이고, 해나는 닉의 셔츠를 입고 있다. 닉은 해나가 머리를 부딪치고 맥주 웅덩이에서 거의 헤엄치고 있어서 셔츠를 줬다며, 훔쳐보진 않았다고, 많이는 안 봤다고 능청을 떤다. 해나는 작년에 닉이 데릭 차인 줄 알고 테이프로 칭칭 감아 놓은 차가 자기 차였다고 쏘아붙인다.</w:t>
+        <w:t>해나가 눈을 뜬 곳은 닉의 집 침대이고, 해나는 닉의 셔츠를 입고 있다. 「진정해. 네 신장 빼 간 거 아니니까.」 닉은 해나가 머리를 부딪치고 맥주 웅덩이에서 거의 헤엄치고 있어서 셔츠를 줬다며, 훔쳐보진 않았다고, 많이는 안 봤다고 능청을 떤다. 해나는 작년에 닉이 데릭 차인 줄 알고 테이프로 칭칭 감아 놓은 차가 자기 차였다고 쏘아붙인다.</w:t>
       </w:r>
     </w:p>
     <w:p>
@@ -2904,7 +2904,7 @@
           <w:b w:val="0"/>
           <w:sz w:val="21"/>
         </w:rPr>
-        <w:t>두 사람의 입술이 닿는 순간 라커룸 문이 열리고, 첫째 라이언이 마이크를 든 채 학교 방송 카메라를 끌고 들어온다. 배신자 여동생을 망신 주려고 오빠들이 꾸민 경기 전 깜짝 코너다. 카메라에 해나와 닉이 그대로 잡히고, 해나는 카메라라며 얼굴을 가린다. 닉은 자기가 처리하겠다고, 자기만 믿으라며 카메라 앞을 막아선다.</w:t>
+        <w:t>두 사람의 입술이 닿는 순간 라커룸 문이 열리고, 데릭이 마이크를 든 채 학교 방송 카메라를 끌고 들어온다. 배신자 여동생을 망신 주려고 데릭과 오빠들이 꾸민 경기 전 깜짝 코너다. 카메라에 해나와 닉이 그대로 잡히고, 해나는 카메라라며 얼굴을 가린다. 닉은 자기가 처리하겠다고, 자기만 믿으라며 카메라 앞을 막아선다.</w:t>
       </w:r>
     </w:p>
     <w:p>
@@ -3033,7 +3033,7 @@
           <w:b w:val="0"/>
           <w:sz w:val="21"/>
         </w:rPr>
-        <w:t>애슐리는 수천 명 앞에서 망신당한 것도 모자라 진짜 닉 여자 친구라도 된 줄 아냐고 비웃는다. 해나가 파티까지 와서 시비 거는 쪽이 더 없어 보인다고 받아치자 샤크스 선수들이 환호한다. 그러자 데릭이 끼어들어, 둘이 진짜 잤다면 닉이 불쌍하다고, 해나는 잠자리에서 불가사리처럼 누워만 있다고 떠벌린다. 데릭 뒤에 선 오빠 셋은 이번에도 말리지 않는다. 컵을 쥔 해나의 손이 떨리는 순간, 닉은 직접 겪어 본 자기는 전혀 모르겠다며 문제는 데릭 아니냐고, 거기 제대로 작동은 하냐고 묻는다. 말조심하라는 데릭 앞에서 닉은 해나의 엉덩이를 찰싹 때리고, 이제 방 좀 찾으러 가겠다며 해나를 데리고 나간다.</w:t>
+        <w:t>애슐리는 수천 명 앞에서 망신당한 것도 모자라 진짜 닉 여자 친구라도 된 줄 아냐고 비웃는다. 해나가 받아친다. 「진짜 없어 보이는 건 파티까지 와서 나한테 시비 거는 너야.」 샤크스 선수들이 환호한다. 그러자 데릭이 끼어들어, 둘이 진짜 잤다면 닉이 불쌍하다고, 해나는 잠자리에서 불가사리처럼 누워만 있다고 떠벌린다. 데릭 뒤에 선 오빠 셋은 이번에도 말리지 않는다. 해나가 속으로 이를 간다. 「내 손으로 저 자식 죽여 버릴 거야.」 그 순간 닉은 직접 겪어 본 자기는 전혀 모르겠다며 문제는 데릭 아니냐고, 거기 제대로 작동은 하냐고 묻는다. 말조심하라는 데릭 앞에서 닉은 해나의 엉덩이를 찰싹 때리고, 이제 방 좀 찾으러 가겠다며 해나를 데리고 나간다.</w:t>
       </w:r>
     </w:p>
     <w:p>
@@ -3047,7 +3047,7 @@
           <w:b w:val="0"/>
           <w:sz w:val="21"/>
         </w:rPr>
-        <w:t>침실 문이 닫히자 해나는 데릭 입을 완전히 다물게 했다고 웃는다. 문 밖까지 따라온 데릭과 오빠 셋은 저건 다 쇼고 들어가서 아무것도 안 할 거라고 수군댄다. 닉은 이제 제대로 보여 줄 차례라며 해나 앞으로 다가서고, 뭘 보여 주냐는 해나의 물음에 낮게 답한다. 「진짜처럼.」</w:t>
+        <w:t>침실 문이 닫히자 해나가 닉을 노려본다. 「또 엉덩이 때리면 진짜 가만 안 둬.」 「좋았으면서.」 해나는 데릭 입을 다물게 했다고 웃는다. 문 밖까지 따라온 데릭과 오빠 셋은 다 쇼라고 수군댄다. 닉은 이제 제대로 보여 줄 차례라며 해나 앞으로 다가서고, 뭘 보여 주냐는 해나의 물음에 낮게 답한다. 「진짜처럼.」</w:t>
       </w:r>
     </w:p>
     <w:p>
@@ -3343,7 +3343,7 @@
           <w:b w:val="0"/>
           <w:sz w:val="21"/>
         </w:rPr>
-        <w:t>2. 아기 말을 혼자 알아듣는 보모와, 그 말을 끝까지 믿지 않는 궁정</w:t>
+        <w:t>2. 돈 밝히고 할 말 다 하는 보모와, 웃기는 속마음으로 사건의 단서를 흘리는 아기의 만담</w:t>
       </w:r>
     </w:p>
     <w:p>
@@ -3358,7 +3358,7 @@
           <w:b w:val="0"/>
           <w:sz w:val="21"/>
         </w:rPr>
-        <w:t>3. 아기 동생을 처음 품에 안아 보는 냉혈한 엘프 왕과 인간 보모의 육아 로맨스</w:t>
+        <w:t>3. 동생 재우는 법도 몰라 인간 보모에게 하나하나 지시받는 냉혈한 엘프 왕, 서열이 뒤집힌 육아 로맨스</w:t>
       </w:r>
     </w:p>
     <w:p>
@@ -3418,7 +3418,7 @@
           <w:b w:val="0"/>
           <w:sz w:val="21"/>
         </w:rPr>
-        <w:t>면허 시험 결과를 백 번 새로 고친 끝에 합격을 보고, 이제 싸구려 빵으로 버티는 날은 끝이라며 소리치다 쓰러진 스물여섯 살 소아과 간호사 에밀리 헤이스. 에밀리가 눈을 뜬 곳은 엘프 왕궁의 보모 시험장이다. 엘프 왕의 열 달 된 막내 동생 테오는 죽지 않는 엘프들에게 500년 만에 태어난 아기다. 궁에 아기를 키워 본 엘프가 하나도 없어 모든 종족에게 시험이 열렸지만, 시녀는 마법도 없는 인간은 왕자 근처에 오지도 말라며 에밀리를 밀어낸다.</w:t>
+        <w:t>면허 시험 결과를 백 번 새로 고쳐 합격을 보고, 이제 싸구려 빵은 끝이라며 소리치다 쓰러진 스물여섯 살 소아과 간호사 에밀리 헤이스. 에밀리가 눈을 뜬 곳은 엘프 왕궁 보모 시험장이고, 시녀는 마법도 없는 인간은 왕자 곁에 오지도 말라며 밀어낸다. 보모들이 며칠째 우는 엘프 왕의 열 달 된 막내 동생 테오를 배고파서 그렇다며 누르는 순간, 에밀리에게만 아기 목소리가 들린다. 「등에 핀 박혔어! 금핀도 아파!」 [세 살 미만 엘프 아기의 말을 알아듣습니다] 에밀리는 여기가 어딘지 따지다 만다. 「됐고, 애부터.」</w:t>
       </w:r>
     </w:p>
     <w:p>
@@ -3432,7 +3432,7 @@
           <w:b w:val="0"/>
           <w:sz w:val="21"/>
         </w:rPr>
-        <w:t>며칠째 우는 테오를 엘프 보모들이 배고파서 그렇다며 누르는 순간, 등에 가시가 박혔다는 아기 목소리가 에밀리의 귀에 들린다. [세 살 미만 엘프 아기의 말을 알아듣습니다] 에밀리가 막아서자 시녀는 인간이 엘프 아기 말을 알아듣느냐고 비웃고, 왕족 몸에 손대면 죽는다고 경고한다. 에밀리는 강보 속에 손을 넣어 테오의 등을 찌르던 가시 브로치를 뽑아내고, 엘프 왕 에이드리언이 들어선다. 「누가 이 인간한테 내 동생 몸에 손대라고 했지?」 테오의 피가 묻은 손으로 에밀리가 답한다. 「내 목이 필요하면 가져가요. 피부터 멈추고요.」</w:t>
+        <w:t>에밀리는 배고픈 게 아니라 아픈 거라며 보모들을 막아서고, 인간이 엘프 아기 말을 알아듣느냐는 시녀의 비웃음에 맞받는다. 「알아듣든 말든, 너희가 애를 충분히 괴롭혔다는 건 알아요.」 시녀가 왕족 몸에 손대면 죽는다고 경고하지만, 에밀리는 강보 속 테오 등을 찌르던 금 브로치를 뽑아내고, 엘프 왕 에이드리언이 들어선다. 「누가 이 인간한테 내 동생 몸에 손대라고 했지?」 테오의 피가 묻은 손으로 에밀리가 답한다. 「내 목이 필요하면 가져가요. 피부터 멈추고요.」</w:t>
       </w:r>
     </w:p>
     <w:p>
@@ -3461,7 +3461,7 @@
           <w:b w:val="0"/>
           <w:sz w:val="21"/>
         </w:rPr>
-        <w:t>에이드리언은 테오에게 손대도 된다고 한 적은 없다며 살려 둘 이유를 하나만 대라고 하고, 에밀리는 자기 손가락을 꼭 쥐고 놓지 않는 테오를 내민다. 경비는 에밀리가 브로치를 숨겨 놓고 영웅 노릇을 했다고 몰아세우지만, 브로치에 새겨진 이름은 보육 총괄 자리를 300년 지켜 온 아그네스다. 왕의 어머니인 대비는 아그네스를 꾸짖으면서도, 인간은 한 번 운이 좋았을 뿐이라고 못 박는다.</w:t>
+        <w:t>에이드리언이 에밀리 목에 칼을 대고 살려 둘 이유를 하나만 대라고 하자, 에밀리는 자기 손가락을 꼭 쥔 테오의 손을 들어 보인다. 「이제 얘가 안 놓잖아요. 직접 봐요.」 경비는 에밀리가 브로치를 숨겨 놓고 영웅 노릇을 했다고 몰아세우지만, 브로치에 새겨진 이름은 300년째 보모장인 아그네스다. 대비는 아그네스를 꾸짖으면서도 인간은 한 번 운이 좋았을 뿐이라고 못 박는다.</w:t>
       </w:r>
     </w:p>
     <w:p>
@@ -3475,7 +3475,7 @@
           <w:b w:val="0"/>
           <w:sz w:val="21"/>
         </w:rPr>
-        <w:t>에이드리언이 다가서자 테오가 다시 자지러지지만, 형한테서 쇠 냄새와 피 냄새가 난다는 테오의 말은 에밀리에게만 들린다. 에밀리가 전장에서 막 돌아온 왕에게 갑옷 망토를 벗으라고 하자, 에이드리언은 노려보다가 아기 코는 어른보다 예민하다는 말에 망토를 태우라고 명령한다. 망토가 타자 테오는 형 품에서 처음으로 울음을 그친다. 품삯도 왕실답게 달라는 에밀리에게 에이드리언은 하루를 주겠다며 금화 천 닢을 걸고, 테오가 낫지 않으면 에밀리도 아그네스도 궁을 떠나라고 한다. 꿀병을 든 에밀리의 손이, 이걸 먹으면 배 속에서 전쟁이 난다는 테오의 말에 멈춘다. 「잠깐만요. 이 꿀, 뭔가 이상해요.」</w:t>
+        <w:t>에이드리언이 다가서자 테오가 다시 자지러진다. 「형한테서 이상한 냄새 나. 건초에서 굴렀어?」 에밀리가 망토에 밴 짐승 쫓는 풀 냄새라며 벗으라고 하자, 에이드리언은 전장에서 입은 망토라며 노려보다가 태우게 한다. 형 품에서 테오가 처음으로 울음을 그치자, 에밀리는 목숨 걸고 왕족 일을 하니 품삯도 왕실답게 달라고 한다. 「나한테 조건을 거는 자는 없다.」 「그럼 하루만 줘요.」 에이드리언은 그 하루에 금화 천 닢을 걸고, 테오가 낫지 않으면 에밀리도 아그네스도 궁을 떠나라고 한다. 꿀병을 든 에밀리의 손이, 먹으면 배 속에서 전쟁이 난다는 테오의 말에 멈춘다. 「잠깐만요. 이 꿀, 뭔가 이상해요.」</w:t>
       </w:r>
     </w:p>
     <w:p>
@@ -3504,7 +3504,7 @@
           <w:b w:val="0"/>
           <w:sz w:val="21"/>
         </w:rPr>
-        <w:t>그 말에 대신들은 달이슬 꿀이 엘프 왕족 아기의 유일한 음식이라며 펄쩍 뛰지만, 테오는 에밀리에게 단 꿀이 나쁜 놈이라고 일러 준다. 에밀리는 테오가 꿀만 먹으면 배가 부풀고 두드러기가 나는데도, 아그네스가 42일은 참아야 한다며 계속 먹여 왔다는 걸 알아낸다. 에밀리가 테오의 팔뚝 두 곳에 꿀과 염소젖을 한 방울씩 떨어뜨리자, 겁먹은 테오가 가시덩굴을 터뜨리지만 에밀리는 팔을 빼지 않는다. 두드러기는 꿀 자리에만 돋고, 어떤 치유 마법도 못 잡아낸 알레르기가 드러난다.</w:t>
+        <w:t>그 말에 대신들은 달이슬 꿀이 왕족 아기의 유일한 음식이라며 펄쩍 뛰고, 에밀리가 받아친다. 「내 일은 애를 먹이는 거지, 꿀의 왕실 명예를 지키는 게 아니에요.」 에이드리언이 독도 저주도 없으니 투정이라고 하자 테오가 칭얼거린다. 「단 꿀은 나쁜 놈이야. 먹으면 배가 싸워.」 에밀리는 테오가 꿀만 먹으면 배가 부풀고 두드러기가 나는데도, 아그네스가 42일은 참아야 한다며 먹여 왔다는 걸 알아낸다. 에밀리가 테오 팔뚝에 꿀과 염소젖을 한 방울씩 떨어뜨리자 겁먹은 테오가 가시덩굴을 터뜨리지만, 에밀리는 팔을 빼지 않는다. 두드러기는 꿀 자리에만 돋는다.</w:t>
       </w:r>
     </w:p>
     <w:p>
@@ -3518,7 +3518,7 @@
           <w:b w:val="0"/>
           <w:sz w:val="21"/>
         </w:rPr>
-        <w:t>에이드리언이 가시가 튈 줄 알면서 왜 손을 내밀었냐고 묻자, 에밀리는 무서웠다고, 금화도 아직 못 받았지만 금화가 없어도 구했을 거라고 답한다. 첫 시험 합격이 선언되자 아그네스는 사흘 뒤 별나무 아래 이름 짓기 의식에서 인간이 왕자를 안고 있으면 모든 엘프 가문의 웃음거리가 된다고 막아서지만, 에이드리언은 그중 누구라도 테오에게 젖병 하나를 비우게 하면 그때 웃으라고 한다. 가시 없이 재우면 금화 백 닢을 더 주겠다는 말에, 에밀리는 테오를 안고 으름장을 놓는다. 「침대 또 가시로 뚫으면 값 올린다.」</w:t>
+        <w:t>에이드리언이 가시가 튈 줄 알면서 왜 손을 내밀었냐고 묻자, 에밀리는 무서웠다고, 금화도 아직 못 받았지만 금화 없어도 구했을 거라고 답한다. 아그네스가 사흘 뒤 이름 짓기 의식에 인간이 왕자를 안고 나가면 웃음거리가 된다고 막아서자, 에이드리언은 누구든 테오에게 젖병 하나를 먼저 비우게 하면 웃으라고 한다. 가시 없이 재우면 금화 백 닢을 더 준다는 말에 에밀리가 테오를 안아 든다. 「침대 또 가시로 뚫으면 값 올린다.」</w:t>
       </w:r>
     </w:p>
     <w:p>
@@ -3547,7 +3547,7 @@
           <w:b w:val="0"/>
           <w:sz w:val="21"/>
         </w:rPr>
-        <w:t>그날 밤 테오는 자고 나면 형이 또 도망간다며 잠을 버틴다. 아그네스는 잠 가루를 더 타라고 하지만, 에밀리는 열 달 된 아기에게 약은 안 된다며 모두를 내보낸다. 에밀리는 매일 밤 테오를 혼자 가둬 두는 에이드리언에게, 깰 때마다 아무도 없으니 잠이 무서운 거라고 말한다. 국경 보고서가 세 건이라던 에이드리언은 오늘 밤을 빼먹으면 테오가 다시는 형을 안 믿을 거라는 말에 30분만 곁에 남는다. 동화 대신 국경에 병사 삼천, 식량은 27일 치라는 보고서를 읽어 주는 사이 테오는 잠들고, 형이 아직 있다고 웅얼거리는 테오의 말은 에밀리만 듣는다. 에밀리는 테오가 기억할 건 형이 이긴 전쟁이 아니라 무서울 때 와 줬는지라고 말한다.</w:t>
+        <w:t>그날 밤 테오는 자고 나면 형이 또 도망간다며 잠을 버틴다. 에밀리는 잠 가루를 더 타자는 아그네스까지 모두 내보내고, 매일 밤 테오를 혼자 가둬 두는 에이드리언에게 깨면 아무도 없으니 잠이 무서운 거라고 말한다. 국경 보고서가 세 건이라던 에이드리언은 오늘 밤을 빼먹으면 테오가 다시는 형을 안 믿을 거라는 말에 남는다. 「뭘 하면 되는지 말해.」 동화를 읽어 주라는 말에 에이드리언이 굳는다. 「…할 줄 몰라.」 「엘프 왕도 못 하는 게 있네요.」 결국 에이드리언은 동화 대신 국경에 병사 삼천, 식량 27일 치라는 보고서를 읽고, 테오는 지루하다며 금세 잠든다.</w:t>
       </w:r>
     </w:p>
     <w:p>
@@ -3561,7 +3561,7 @@
           <w:b w:val="0"/>
           <w:sz w:val="21"/>
         </w:rPr>
-        <w:t>그 시각 아그네스는 대비에게 하루짜리 인간에게 이름 짓기 의식을 맡기느냐고 따지고, 대비는 그럼 네 300년이 그 인간의 하루보다 낫다는 걸 보여 보라고 한다. 잠결의 테오는 요람 위 별빛 수정이 뜨겁고 못생겼다고 칭얼거린다. 에이드리언이 넘겨 보는 유모 열두 명의 일지는 수백 장이 칭찬뿐이고, 테오가 무엇을 무서워하는지는 한 줄도 없다.</w:t>
+        <w:t>그 시각 아그네스가 하루짜리 인간에게 의식을 맡기느냐고 따지자, 대비는 네 300년이 그 하루보다 낫다는 걸 보여 보라고 한다. 잠결의 테오가 요람 위 별빛 수정을 두고 웅얼거린다. 「저거 뜨겁고 못생겼어. 인간 다크서클이 더 예뻐.」 에밀리가 대꾸한다. 「고맙다. 근데 그거 욕이야.」 에이드리언이 넘겨 보는 유모 열두 명의 일지는 수백 장이 칭찬뿐이고, 테오가 무엇을 무서워하는지는 한 줄도 없다.</w:t>
       </w:r>
     </w:p>
     <w:p>
@@ -3590,7 +3590,7 @@
           <w:b w:val="0"/>
           <w:sz w:val="21"/>
         </w:rPr>
-        <w:t>테오가 무서워하는 그 별빛 수정은 이름 짓기 의식 날, 모든 엘프 가문이 모인 별나무 아래에도 걸려 있다. 한 귀부인은 오늘 왕자에게 무슨 일이 생기면 천한 인간은 내일을 못 본다고 경고한다. 에밀리가 수정부터 치우자고 하자 귀족들은 별빛 축복은 전통이라며 비웃지만, 에이드리언은 의식 때마다 울던 테오를 이 인간이 처음 달랬다며 빛을 반으로 줄이라고 명령한다.</w:t>
+        <w:t>테오가 무서워하는 그 별빛 수정은 이름 짓기 의식 날, 모든 엘프 가문이 모인 별나무 아래에도 걸려 있다. 한 귀부인은 왕자에게 무슨 일이 생기면 천한 인간은 내일을 못 본다고 경고한다. 에밀리가 수정부터 치우자고 하자 귀족들은 별빛 축복은 전통이라며 비웃지만, 에이드리언은 의식 때마다 울던 테오를 이 인간이 처음 달랬다며 빛을 반으로 줄이라고 명령한다.</w:t>
       </w:r>
     </w:p>
     <w:p>
@@ -3604,7 +3604,7 @@
           <w:b w:val="0"/>
           <w:sz w:val="21"/>
         </w:rPr>
-        <w:t>다음은 왕자가 만져 왕족의 힘을 보여야 하는, 세계수의 빛나는 씨앗을 담은 성물 쟁반이다. 에밀리는 테오가 뭐든 입에 넣으니 쟁반을 치우라고 하지만, 귀족들은 성물을 인간의 사탕 취급하느냐며 화를 낸다. 에밀리가 열 달 된 아기는 자기 발가락도 깨문다고 맞서는 사이, 반짝이는 건 비싸고 비싼 건 맛있다는 테오가 씨앗 하나를 삼킨다. 에밀리가 달려들지만 테오는 이미 숨도 심장도 멎어 있다. 대비가 무조건 살려 내라고 비명을 지르는 가운데, 아그네스가 에밀리를 가리킨다. 「이 인간이 왕자님을 죽였어요.」</w:t>
+        <w:t>다음은 왕자가 만져 왕족의 힘을 보여야 하는, 세계수의 빛나는 씨앗을 담은 성물 쟁반이다. 에밀리가 테오는 뭐든 입에 넣는다며 쟁반을 치우라고 하자 귀족들은 성물을 인간의 사탕 취급하느냐며 화를 낸다. 「열 달 된 애는 자기 발가락도 깨물어요. 얘가 성물인 줄 알겠어요?」 그 사이 테오가 씨앗 하나를 집어 든다. 「반짝반짝. 비싸? 비싸면 맛있어.」 테오가 씨앗을 삼키고, 에밀리가 달려들었을 때는 숨도 심장도 멎어 있다. 대비가 무조건 살려 내라고 비명을 지르는 가운데, 아그네스가 에밀리를 가리킨다. 「이 인간이 왕자님을 죽였어요.」</w:t>
       </w:r>
     </w:p>
     <w:p>
@@ -3633,7 +3633,7 @@
           <w:b w:val="0"/>
           <w:sz w:val="21"/>
         </w:rPr>
-        <w:t>아그네스의 말에 에이드리언은 궁 문을 모두 닫으라며, 테오가 죽으면 오늘 테오에게 손댄 자는 누구도 궁을 나가지 못한다고 못 박는다. 대비는 쓸모없는 인간을 지하 감옥에 처넣으라고 하고, 치유사도 숨이 끊겼다고 선언한다. 끌려가던 에밀리는 맛없는 게 목에 걸렸다는 테오의 희미한 목소리를 듣고, 테오가 살아 있다고 소리친다. 테오의 말을 듣는 사람은 자기 하나뿐이라는 에밀리에게, 대비는 실패하면 자기 손으로 죽이겠다며 기회를 준다.</w:t>
+        <w:t>아그네스의 말에 에이드리언은 궁 문을 모두 닫으라며, 테오가 죽으면 오늘 테오에게 손댄 자는 누구도 궁을 나가지 못한다고 못 박는다. 대비는 쓸모없는 인간을 지하 감옥에 처넣으라고 하고, 치유사도 숨이 끊겼다고 선언한다. 끌려가던 에밀리의 귀에 테오의 희미한 목소리가 들린다. 「맛없어. 걸렸어.」 테오가 살아 있다고, 테오 말을 듣는 사람은 자기 하나뿐이라고 소리치는 에밀리에게, 대비는 실패하면 자기 손으로 죽이겠다며 기회를 준다.</w:t>
       </w:r>
     </w:p>
     <w:p>
@@ -3647,7 +3647,7 @@
           <w:b w:val="0"/>
           <w:sz w:val="21"/>
         </w:rPr>
-        <w:t>에밀리가 테오에게 목 안의 빛을 밀어내라고 하자 에이드리언은 아기가 어떻게 알아듣느냐고 하고, 에밀리는 못 알아듣는 건 당신이라고 쏘아붙인다. 돌아오라고 명령하는 에이드리언에게 에밀리는 명령 말고 이름을 부르라고 소리친다. 「테오, 형이야. 돌아와.」 그 순간 씨앗이 튀어나오고, 터져 나온 빛이 테오를 온몸으로 감싼 에밀리를 덮친다. 첫날 손대면 죽는다던 그 왕자를 에밀리는 끝까지 품에 안은 채다. 카메라는 끝내 빛 속을 비추지 않고, 저 빛이면 엘프 군주도 먼지가 된다며 에밀리가 죽었다고 중얼거리던 에이드리언이 소리친다. 「에밀리, 대답해!」</w:t>
+        <w:t>에밀리가 테오에게 목에 걸린 씨앗을 밀어내라고 하자 에이드리언은 아기가 어떻게 알아듣느냐고 한다. 「얘는 알아들어요. 못 알아듣는 건 당신이에요.」 에이드리언이 돌아오라고 명령하자 에밀리가 소리친다. 「명령 말고 이름을 불러요!」 그제야 에이드리언이 동생을 부른다. 「테오, 형이야. 돌아와.」 그 순간 씨앗이 튀어나오고, 터져 나온 빛이, 손대면 죽는다던 그 왕자를 끝까지 품에 안은 에밀리를 덮친다. 카메라는 빛 속을 비추지 않고, 저 빛이면 엘프 군주도 먼지가 된다며 에밀리가 죽었다고 중얼거리던 에이드리언이 소리친다. 「에밀리, 대답해!」</w:t>
       </w:r>
     </w:p>
     <w:p>
@@ -3897,7 +3897,7 @@
           <w:b w:val="0"/>
           <w:sz w:val="21"/>
         </w:rPr>
-        <w:t>밀린 방세에 쫓기다 치유사 증표 시험에 붙은 날 빙판에 머리를 부딪친 인간 치유사가, 세 살 미만 아기의 말이 들리는 능력을 얻어, 부모를 잃고 울기만 하는 아기 용 왕자의 유모 시험에 뛰어들고, 손대면 증표를 잃는다는 그 왕자를 몇 번이고 살려 내, 끝내 얼음 용의 왕과 왕궁 전체의 마음을 얻는 이야기.</w:t>
+        <w:t>밀린 방세에 쫓기다 빙판에 머리를 부딪친 인간 치유사가, 세 살 미만 아기의 말이 들리는 능력을 얻어, 돈을 벌러 손대면 목이 날아간다는 아기 용 왕자의 유모 시험에 뛰어들고, 그 왕자의 말을 혼자 알아들어 몇 번이고 살려 내, 끝내 얼음 용의 왕과 왕궁 전체의 마음을 얻는 이야기.</w:t>
       </w:r>
     </w:p>
     <w:p>
@@ -3928,7 +3928,7 @@
           <w:b w:val="0"/>
           <w:sz w:val="21"/>
         </w:rPr>
-        <w:t>1. 아기 용의 말을 혼자 알아듣는 인간 치유사와, 그 말을 끝까지 믿지 않는 용의 왕궁 사이의 정보 비대칭</w:t>
+        <w:t>1. 돈 밝히고 할 말 다 하는 인간 유모와, 웃기는 속마음으로 사건의 단서를 흘리는 아기 용의 만담</w:t>
       </w:r>
     </w:p>
     <w:p>
@@ -3943,7 +3943,7 @@
           <w:b w:val="0"/>
           <w:sz w:val="21"/>
         </w:rPr>
-        <w:t>2. 말 못 하는 아기 왕자의 속마음 대사로 웃기고 울리는 귀여운 아기 소구</w:t>
+        <w:t>2. 아기 용의 말을 혼자 알아듣는 인간 유모와, 그 말을 끝까지 안 믿는 용 왕궁 사이의 정보 비대칭</w:t>
       </w:r>
     </w:p>
     <w:p>
@@ -3958,7 +3958,7 @@
           <w:b w:val="0"/>
           <w:sz w:val="21"/>
         </w:rPr>
-        <w:t>3. 방세 밀린 인간 치유사가 얼음 용의 왕 곁에 서는 신데렐라 판타지 + 겨울 육아 로맨스</w:t>
+        <w:t>3. 최강 얼음 용의 왕이 육아 초보라 인간 유모에게 지시받는 서열 역전 + 겨울 육아 로맨스</w:t>
       </w:r>
     </w:p>
     <w:p>
@@ -4018,7 +4018,7 @@
           <w:b w:val="0"/>
           <w:sz w:val="21"/>
         </w:rPr>
-        <w:t>치유사 시험에 붙어 증표를 흔들며 밀린 방세는 이제 끝이라고 소리치다 빙판에 머리를 부딪친 스물다섯 살 인간 치유사 케이티 레인. 그날 저녁 방세를 벌러 간 얼음 용 왕궁 유모 시험장에서, 30년 경력의 궁 유모장 마거릿은 인간 따위는 아기 곁에 오지도 말라며 케이티를 밀어낸다. 석 달 전 폭풍에 부모를 잃은 얼음 용의 왕 헨리의 열 달 된 막내 동생, 아기 용 왕자 올리가 그날부터 울기만 하자, 동지 연회에서 올리를 후계자로 처음 내보여야 하는 할머니 대비 루스가 연 시험이다.</w:t>
+        <w:t>치유사 증표를 딴 날, 밀린 방세는 끝이라고 소리치다 빙판에 머리를 부딪친 인간 치유사 케이티 레인. 그날 저녁 방세를 벌러 간 얼음 용 왕궁에서는, 얼음 용의 왕 헨리의 막내 동생인 열 달 된 아기 용 왕자 올리가 석 달 전 폭풍에 부모를 잃고 울기만 해서 유모 시험이 열린다. 30년 경력의 궁 유모장 마거릿은 인간은 오지도 말라며 케이티를 밀어낸다.</w:t>
       </w:r>
     </w:p>
     <w:p>
@@ -4032,7 +4032,7 @@
           <w:b w:val="0"/>
           <w:sz w:val="21"/>
         </w:rPr>
-        <w:t>유모들이 배고파 그렇다며 젖병을 물리는 순간, 등에 바늘이 박혔다는 아기 목소리가 들린다. 머리를 다친 뒤 케이티에게만 세 살 미만 아기 말이 들린다. 케이티가 막아서자 마거릿은 인간이 아기 용 말을 알아듣냐고 비웃고, 왕자 몸에 손대면 끝장이라고 경고한다. 케이티는 담요 속에 손을 넣어 등을 찌르던 브로치를 뽑아내고, 헨리가 들어선다. 「누가 내 동생 몸에 손대라고 했지?」 오늘 받은 증표부터 빼앗겠다는 헨리에게, 피 묻은 손으로 케이티가 답한다. 「증표 가져가요. 피부터 멈추고요.」</w:t>
+        <w:t>유모들이 배고픈 거라며 젖병을 억지로 물리는 순간, 아기 목소리가 들린다. 「등에 바늘 박혔어!」 머리를 다친 뒤로 세 살 미만 아기의 말이 케이티에게만 들리는 것이다. 인간은 비키라는 유모들에게 케이티가 소매를 걷으며 답한다. 「됐고, 애부터.」 배고픈 게 아니라 아픈 거라는 케이티를, 마거릿은 인간이 아기 용 말을 알아듣냐며 비웃는다. 「알아듣든 말든, 당신들이 애를 충분히 괴롭혔다는 건 알아요.」 왕자 몸에 손대면 목이 날아간다는 경고에도 케이티가 담요 속 브로치를 뽑아내자 피가 배어 나오고, 헨리가 들어선다. 헨리가 목부터 치라고 하자, 케이티는 올리 등을 누르며 답한다. 「내 목 가져가요. 피부터 멈추고요.」</w:t>
       </w:r>
     </w:p>
     <w:p>
@@ -4061,7 +4061,7 @@
           <w:b w:val="0"/>
           <w:sz w:val="21"/>
         </w:rPr>
-        <w:t>헨리는 케이티를 감옥에 보내지 않을 이유를 하나만 대라고 하고, 케이티는 자기 손가락을 쥐고 놓지 않는 올리를 내민다. 경비병은 케이티가 브로치를 숨겨 놓고 영웅 노릇을 했다고 몰아세우지만, 그 호랑가시 브로치는 마거릿이 동지마다 옷깃에 다는 것이다. 루스는 마거릿을 꾸짖으면서도, 인간은 한 번 운이 좋았을 뿐이라고 못 박는다.</w:t>
+        <w:t>피를 멈춘 케이티에게 헨리가 살려 둘 이유를 하나만 대라고 하자, 케이티는 자기 손가락을 쥔 올리를 내민다. 「이제 얘가 안 놓잖아요. 직접 봐요.」 경비병은 케이티가 브로치를 숨겨 두고 영웅인 척했다고 몰아세우지만 호랑가시 브로치는 마거릿 것이고, 할머니 대비 루스는 마거릿을 꾸짖으면서도 인간은 한 번 운이 좋았을 뿐이라고 한다.</w:t>
       </w:r>
     </w:p>
     <w:p>
@@ -4075,7 +4075,7 @@
           <w:b w:val="0"/>
           <w:sz w:val="21"/>
         </w:rPr>
-        <w:t>헨리가 다가서자 올리가 자지러지지만, 형한테서 나쁜 냄새가 난다는 올리의 말은 케이티에게만 들린다. 헨리의 눈표범 털 외투에 밴 장작 연기와 독한 술 냄새다. 케이티가 외투를 벗으라고 하자 헨리는 그 외투가 케이티의 1년 치 방세보다 비싸다고 비웃다가, 아기 코는 어른보다 예민하다는 말에 외투를 벽난로에 던지라고 명령한다. 외투가 타자 올리는 형 품에서 처음으로 울음을 그친다. 돈도 왕답게 달라는 케이티에게 헨리는 하루를 주겠다며 은화 만 닢을 걸고, 올리가 낫지 않으면 케이티도 마거릿도 궁을 떠나라고 한다. 눈사슴 젖병을 든 케이티의 손이, 이걸 먹으면 배 속에서 전쟁이 난다는 올리의 말에 멈춘다. 「잠깐만요. 이 사슴젖, 뭔가 이상해요.」</w:t>
+        <w:t>헨리가 다가서자 올리가 또 자지러지게 운다. 「형한테서 이상한 냄새 나. 건초에서 굴렀어?」 케이티가 냄새 밴 외투를 벗으라고 하자 헨리는 1년 치 방세보다 비싼 외투라고 비웃다가, 아기 코는 어른보다 예민하다는 말에 외투를 벽난로에 던지게 한다. 외투가 타자 올리는 형 품에서 처음 울음을 그친다. 목숨 걸고 왕족 일을 하니 돈도 왕실답게 달라는 케이티에게 헨리가 답한다. 「나한테 조건 거는 사람은 없다.」 「그럼 하루만 줘요.」 헨리는 그 하루에 은화 만 닢을 걸고, 올리가 안 나으면 케이티도 마거릿도 궁을 떠나라고 한다. 젖병을 든 케이티 손이, 이거 먹으면 배에서 전쟁 난다는 올리 말에 멈춘다. 「잠깐만요. 이 사슴젖, 뭔가 이상해요.」</w:t>
       </w:r>
     </w:p>
     <w:p>
@@ -4104,7 +4104,7 @@
           <w:b w:val="0"/>
           <w:sz w:val="21"/>
         </w:rPr>
-        <w:t>그 말에 왕실 의원은 왕가 아기들이 대대로 먹어 온 눈사슴 젖이라며 펄쩍 뛰지만, 올리는 케이티에게 단 젖이 나쁜 놈이라고 일러 준다. 케이티는 올리가 사슴젖만 먹으면 배가 부풀고 두드러기가 나는데도, 마거릿이 42일은 참아야 한다며 계속 먹여 왔다는 걸 알아낸다. 무슨 일이 생기면 증표는 끝이라는 헨리의 경고에도 케이티는 올리의 팔뚝 두 곳에 사슴젖과 당나귀 젖을 한 방울씩 떨어뜨리고, 두드러기는 사슴젖 자리에만 돋는다. 석 달 동안 어떤 의원도 못 잡아낸 사슴젖 알레르기다.</w:t>
+        <w:t>왕실 의원은 왕가가 대대로 먹여 온 눈사슴 젖에 토를 다느냐고 펄쩍 뛴다. 「내 일은 애한테 젖을 먹이는 거지, 젖의 왕실 명예를 지키는 게 아니에요.」 단 젖은 나쁜 놈이라는 올리 말대로, 사슴젖만 먹으면 올리 배가 부풀고 두드러기가 나는데 마거릿은 42일은 참으라며 먹여 왔다. 케이티가 올리 팔뚝 두 곳에 사슴젖과 당나귀 젖을 한 방울씩 떨어뜨리자, 가려운 올리가 불을 뿜어 아기 침대가 불탄다. 불길 속에서도 케이티는 올리 팔을 놓지 않고, 두드러기는 사슴젖 자리에만 돋는다. 석 달 동안 어떤 의원도 못 잡아낸 알레르기다.</w:t>
       </w:r>
     </w:p>
     <w:p>
@@ -4118,7 +4118,7 @@
           <w:b w:val="0"/>
           <w:sz w:val="21"/>
         </w:rPr>
-        <w:t>당나귀 젖을 다 비운 올리를 보며 헨리가 증표를 빼앗길 줄 알면서 왜 했냐고 묻자, 케이티는 무서웠다고, 돈도 아직 못 받았지만 돈이 없어도 했을 거라고 답한다. 첫 시험 합격이 선언되자 마거릿은 사흘 뒤 동지 연회에서 인간이 후계자를 안고 있으면 영주와 사신들의 웃음거리가 된다고 막아서지만, 헨리는 그중 누구라도 올리에게 젖병 하나를 비우게 하면 그때 웃으라고 한다. 울지 않고 재우면 은화 천 닢을 더 주겠다는 말에, 케이티는 올리를 안고 으름장을 놓는다. 「오늘 밤 또 울면 값 올린다.」</w:t>
+        <w:t>당나귀 젖을 다 비운 올리 곁에서 헨리가 왜 불길 속에서 손을 안 뺐냐고 묻자, 케이티는 무서웠다고, 돈도 아직 못 받았지만 돈이 없어도 했을 거라고 답한다. 첫 시험에 붙자 마거릿은 사흘 뒤 동지 연회에서 인간이 후계자를 안으면 웃음거리라고 막아서지만, 헨리는 누구든 올리에게 젖병 하나를 비우게 하면 그때 웃으라고 한다. 불 없이 재우면 은화 천 닢을 더 준다는 말에, 케이티는 올리를 들어 올리고 손가락을 세운다. 「침대 또 태우면 값 올린다.」</w:t>
       </w:r>
     </w:p>
     <w:p>
@@ -4147,7 +4147,7 @@
           <w:b w:val="0"/>
           <w:sz w:val="21"/>
         </w:rPr>
-        <w:t>그날 밤 올리는 자고 나면 형이 또 도망간다며 잠을 버틴다. 마거릿은 잠 물약을 먹이라고 하지만, 케이티는 열 달 된 아기에게 약은 안 된다며 모두를 내보낸다. 케이티는 밤마다 성벽 순찰을 나가며 아기방 문을 잠그는 헨리에게, 폭풍 속으로 날아간 엄마 아빠가 돌아오지 않았듯 깰 때마다 아무도 없으니 잠이 무서운 거라고 말한다. 오늘 밤을 빼먹으면 올리가 다시는 형을 안 믿을 거라는 말에 30분만 곁에 있게 된 헨리는, 동화 대신 올겨울 세금이 은화 27만 닢, 새 기사가 3천 명이라는 장부를 읽어 준다. 잠든 올리가 형이 아직 있다고 웅얼거리는 말은 케이티만 듣고, 케이티는 올리가 기억할 건 형이 거둔 세금이 아니라 무서울 때 와 준 형이라고 말한다.</w:t>
+        <w:t>그날 밤 올리는 자고 나면 형이 또 도망간다며 잠을 버틴다. 잠 물약을 먹이자는 마거릿까지 내보낸 케이티는, 밤마다 아기방 문을 잠그고 성벽 순찰을 나가는 헨리에게 엄마 아빠처럼 형도 안 돌아올까 봐 잠이 무서운 거라고 말한다. 헨리가 결국 묻는다. 「뭘 하면 되는지 말해.」 동화를 읽어 주라는 말에 헨리가 굳는다. 「…할 줄 몰라.」 케이티가 웃는다. 「최강 얼음 용도 못 하는 게 있네요.」 헨리가 동화 대신 올겨울 세금이 은화 27만 닢이라는 장부를 읽자, 올리는 지루해서 하품하다 잠든다. 케이티는 올리가 기억할 건 세금이 아니라 무서울 때 와 준 형이라고 말한다.</w:t>
       </w:r>
     </w:p>
     <w:p>
@@ -4161,7 +4161,7 @@
           <w:b w:val="0"/>
           <w:sz w:val="21"/>
         </w:rPr>
-        <w:t>그 시각 마거릿은 루스에게 하루짜리 인간에게 동지 연회를 맡기느냐고 따지고, 루스는 그럼 네 30년이 그 인간의 하루보다 낫다는 걸 보여 보라고 한다. 잠결의 올리는 요람 옆 촛불이 뜨겁고 못생겼다고 칭얼거린다. 헨리가 넘겨 보는 유모 열두 명의 일지는 수백 장이 칭찬뿐이고, 올리가 무엇을 무서워하는지는 한 줄도 없다.</w:t>
+        <w:t>그 시각 마거릿이 하루짜리 인간에게 연회를 맡기느냐고 따지자, 루스는 네 30년이 그 하루보다 낫다는 걸 보여 보라고 한다. 아기방에서는 잠든 올리가 잠꼬대를 한다. 「촛불 뜨겁고 못생겼어. 인간 다크서클이 더 예뻐.」 케이티가 눈 밑을 문지른다. 「고맙다. 근데 그거 욕이야.」 헨리가 넘겨 보는 유모 열두 명의 일지는 수백 장이 칭찬뿐이고, 올리가 무엇을 무서워하는지는 한 줄도 없다.</w:t>
       </w:r>
     </w:p>
     <w:p>
@@ -4190,7 +4190,7 @@
           <w:b w:val="0"/>
           <w:sz w:val="21"/>
         </w:rPr>
-        <w:t>올리가 무서워하는 그 뜨거운 촛불은 한 해 가장 긴 밤, 영주와 사신들이 선물을 들고 모인 동지 연회장에서 천장까지 닿는 상록수 가지마다 타고 있다. 한 영주의 부인은 오늘 왕자에게 무슨 일이 생기면 인간 치유사 따위는 이 왕국에서 다시는 일 못 한다고 경고한다. 케이티가 촛불부터 끄자고 하자 손님들은 후계자의 첫 초상화를 그 촛불 아래서 그리는 게 전통이라며 비웃지만, 헨리는 연회 때마다 울던 올리를 이 치유사가 처음 달랬다며 촛불을 반으로 줄이라고 명령한다.</w:t>
+        <w:t>올리가 무서워하는 그 뜨거운 촛불은 한 해 가장 긴 밤, 동지 연회장의 천장까지 닿는 상록수 가지마다 타고 있다. 한 영주 부인은 오늘 왕자에게 무슨 일이 생기면 인간 따위는 내일 해를 못 본다고 경고한다. 케이티가 촛불부터 끄자고 하자 손님들은 후계자의 첫 초상화를 그 불빛 아래서 그리는 게 전통이라며 비웃지만, 헨리는 연회 때마다 울던 올리를 이 치유사가 처음 달랬다며 촛불을 반으로 줄이게 한다.</w:t>
       </w:r>
     </w:p>
     <w:p>
@@ -4204,7 +4204,7 @@
           <w:b w:val="0"/>
           <w:sz w:val="21"/>
         </w:rPr>
-        <w:t>다음은 후계자가 손에 들고 초상화를 그려야 하는, 은방울이 주렁주렁 달린 백 년 된 왕가의 가보 장식이다. 케이티는 올리가 뭐든 입에 넣으니 치우라고 하지만, 영주들은 가보를 사탕 취급하느냐며 화를 낸다. 케이티가 열 달 된 아기는 자기 발가락도 깨문다고 맞서는 사이, 반짝이는 건 비싸고 비싼 건 맛있다는 올리가 은방울 하나를 뜯어 삼킨다. 케이티가 달려들지만 올리는 이미 숨도 맥도 멎어 있다. 루스가 무조건 살려 내라고 비명을 지르는 가운데, 마거릿이 케이티를 가리킨다. 「이 치유사가 왕자님을 죽였어요.」</w:t>
+        <w:t>다음은 후계자가 손에 쥐고 초상화를 그려야 하는, 은방울이 주렁주렁 달린 백 년 된 왕가의 가보다. 뭐든 입에 넣는 아기니 치우라는 케이티에게 영주들은 가보를 사탕 취급하느냐며 화를 낸다. 「열 달 된 애는 자기 발가락도 깨물어요. 그게 가보인 줄 알겠어요?」 그 사이 올리가 은방울을 빤히 본다. 「반짝반짝. 비싸? 비싸면 맛있어.」 올리가 은방울 하나를 뜯어 삼키고, 케이티가 달려들었을 때는 이미 숨도 맥도 멎어 있다. 루스가 무조건 살려 내라고 비명을 지르는 가운데, 마거릿이 케이티를 가리킨다. 「이 치유사가 왕자님을 죽였어요.」</w:t>
       </w:r>
     </w:p>
     <w:p>
@@ -4233,7 +4233,7 @@
           <w:b w:val="0"/>
           <w:sz w:val="21"/>
         </w:rPr>
-        <w:t>마거릿의 말에 헨리는 궁 문을 모두 얼려 막고, 올리가 죽으면 오늘 올리에게 손댄 사람은 전부 쇠사슬에 묶인다고 못 박는다. 루스는 치유사를 지하 얼음 창고에 가두라고 하고, 왕실 의원은 숨이 끊겼다고 선언한다. 끌려가던 케이티는 맛없는 게 목에 걸렸다는 올리의 희미한 목소리를 듣고, 올리가 살아 있다고 소리친다. 루스는 실패하면 그 증표를 자기 손으로 찢겠다며 케이티에게 기회를 준다.</w:t>
+        <w:t>마거릿의 말에 헨리는 궁 문을 모두 얼려 막고, 올리가 죽으면 오늘 올리에게 손댄 사람은 전부 쇠사슬에 묶인다고 한다. 루스는 케이티를 지하 얼음 창고에 가두라고 하고, 왕실 의원은 숨이 끊겼다고 선언한다. 끌려가던 케이티에게 올리의 희미한 목소리가 들린다. 「맛없어. 걸렸어.」 케이티가 살아 있다고 소리치자, 루스는 실패하면 자기 손으로 케이티의 목을 치겠다며 기회를 준다.</w:t>
       </w:r>
     </w:p>
     <w:p>
@@ -4247,7 +4247,7 @@
           <w:b w:val="0"/>
           <w:sz w:val="21"/>
         </w:rPr>
-        <w:t>케이티가 올리를 팔뚝에 엎드려 눕혀 등을 두드리며 밀어내라고 하자 헨리는 아기가 어떻게 알아듣냐고 하고, 케이티는 못 알아듣는 건 당신이라고 쏘아붙인다. 돌아오라고 명령하는 헨리에게 케이티는 명령 말고 이름을 부르라고 소리친다. 「올리, 형이야. 돌아와.」 그 순간 올리 목에서 은방울이 튀어나오고, 이어 터진 아기 용의 첫 불길이 상록수까지 치솟으며 올리를 감싼 케이티를 덮친다. 첫날 손대면 증표를 빼앗는다던 그 왕자를 케이티는 끝까지 품에 안은 채다. 카메라는 불길 속을 비추지 않고, 저 불이면 얼음 용도 녹는다며 케이티가 죽었다고 중얼거리던 헨리가 소리친다. 「케이티, 대답해!」</w:t>
+        <w:t>케이티가 올리를 팔뚝에 엎드려 눕혀 등을 두드리며 밀어내라고 하자, 헨리는 아기가 어떻게 알아듣냐고 한다. 「얘는 알아들어요. 못 알아듣는 건 당신이에요.」 명령이니 돌아오라는 헨리에게 케이티가 소리친다. 「명령 말고 이름을 불러요!」 「올리, 형이야. 돌아와.」 그 순간 올리 목에서 은방울이 튀어나오고, 목에 막혀 있던 불길이 한꺼번에 터져 상록수까지 치솟으며 올리를 감싼 케이티를 덮친다. 첫날 손대면 목이 날아간다던 그 왕자를 케이티는 끝까지 품에 안은 채다. 카메라는 불길 속을 비추지 않고, 저 불이면 얼음 용도 녹는다며 케이티가 죽었다고 중얼거리던 헨리가 소리친다. 「케이티, 대답해!」</w:t>
       </w:r>
     </w:p>
     <w:p>
@@ -4497,7 +4497,7 @@
           <w:b w:val="0"/>
           <w:sz w:val="21"/>
         </w:rPr>
-        <w:t>어린 날 자신을 구한 은빛 소녀를 찾아 신분을 숨기고 엘프 공주의 가디언이 된 군주 이선. 검은 머리 공주 올리비아는 정략결혼 전, 운명의 짝 표식이 함께 핀 이선에게 어머니 유품만은 돌려 달라고 청한다. 하지만 이선은 그 소녀가 올리비아인 줄 모른 채, 은발 이복동생 제나를 그 소녀라 믿고 올리비아를 짓밟는다.</w:t>
+        <w:t>어린 날 자신을 구한 은빛 소녀를 찾아 신분을 숨기고 엘프 공주의 가디언이 된 군주 이선. 검은 머리 공주 올리비아는 운명의 짝 표식이 핀 이선을 먼저 거부하고, 휠체어 탄 군주와 정략결혼을 자청한다. 하지만 이선은 그 소녀가 올리비아인 줄 모른 채, 은발 이복동생 제나를 그 소녀라 믿고 올리비아를 짓밟는다.</w:t>
       </w:r>
     </w:p>
     <w:p>
@@ -4528,7 +4528,7 @@
           <w:b w:val="0"/>
           <w:sz w:val="21"/>
         </w:rPr>
-        <w:t>1. 평생 찾던 은빛 소녀를 곁에 두고도 몰라본 운명의 짝, 그에게 짓밟히는 진짜 은빛 소녀</w:t>
+        <w:t>1. 짓밟혀도 애원하지 않고 맞받아치는 걸크러시 여주, 양산형 전개를 깨는 반응</w:t>
       </w:r>
     </w:p>
     <w:p>
@@ -4543,7 +4543,7 @@
           <w:b w:val="0"/>
           <w:sz w:val="21"/>
         </w:rPr>
-        <w:t>2. 거절당한 짝의 후회물 정석</w:t>
+        <w:t>2. 평생 찾던 은빛 소녀를 곁에 두고도 몰라보고 짓밟은 운명의 짝, 거절당한 짝의 후회물 정석</w:t>
       </w:r>
     </w:p>
     <w:p>
@@ -4618,21 +4618,7 @@
           <w:b w:val="0"/>
           <w:sz w:val="21"/>
         </w:rPr>
-        <w:t>은발이 순혈의 표식인 엘프 왕가에 검은 머리로 태어나 '빛 없는 공주'로 불리는 열아홉 살 제1공주 올리비아 무어. 가디언을 고르는 날, 은발의 이복동생 제나는 언니가 애인을 고르러 나왔다고 비웃는다. 웃통을 벗고 늘어선 후보들 가운데 혼자 옷을 입은 남자는, 어릴 적 자신을 구한 은빛 소녀를 찾으러 신분을 숨기고 온 다른 왕국의 군주 이선이다. 벗으라는 올리비아에게 이선은 가디언이 되러 왔지 종마가 되러 온 게 아니라고 맞선다. 올리비아가 그를 고르며 손을 잡는 순간, 두 손목에 운명의 짝에게만 피는 은빛 덩굴 표식이 피어난다. 이선은 은빛 소녀가 검은 머리 공주일 리 없다며 소매로 표식을 덮는다. 그 소녀가 올리비아라는 걸 이선은 모른다.</w:t>
-      </w:r>
-    </w:p>
-    <w:p>
-      <w:pPr>
-        <w:keepNext w:val="0"/>
-        <w:spacing w:after="120" w:before="0" w:line="331" w:lineRule="auto"/>
-      </w:pPr>
-      <w:r>
-        <w:rPr>
-          <w:rFonts w:ascii="맑은 고딕" w:hAnsi="맑은 고딕" w:eastAsia="맑은 고딕" w:cs="맑은 고딕"/>
-          <w:b w:val="0"/>
-          <w:sz w:val="21"/>
-        </w:rPr>
-        <w:t>3년 동안 이선은 매일 아침 올리비아의 드레스 끈을 묶어 주고, 올리비아는 그 손길을 사랑이라 믿는다. 그가 다른 왕국의 군주라고 궁정 사람들이 수군대는 결속의 입맞춤 의식에서 이선은 네 생각뿐이라며 입술을 내리다 다른 이름을 부른다. 「나의 사랑, 제나.」 올리비아가 그를 밀어낸다. 「이선 군주, 당신을 거부하겠어.」</w:t>
+        <w:t>은발이 순혈의 표식인 엘프 왕가에 검은 머리로 태어나 '빛 없는 공주'로 불리는 제1공주 올리비아 무어. 가디언을 고르는 날, 올리비아가 삐진 얼굴로 서 있자, 은발의 이복동생 제나는 한 후보의 팔에 바짝 붙어 언니가 가디언을 고르는 거냐 애인을 쇼핑하는 거냐고 비웃는다. 그 후보는 신분을 숨긴 다른 왕국의 군주 이선이다. 이선은 어릴 적 자신을 구한 은빛 소녀가 여기 있을지 몰라 숨어든 거지, 철없는 공주 비위나 맞추러 온 게 아니라고 속으로 되뇐다. 그 소녀가 올리비아라는 걸 이선은 모른다. 웃통을 벗은 후보들 가운데 혼자 옷을 입은 이선 앞에 올리비아가 멈춰 선다. 「너, 왜 아직 옷을 입고 있지?」 이선이 가디언이 되러 왔지 종마 취급 받으러 온 게 아니라고 맞서도, 올리비아는 물러서지 않는다. 「벗어.」 이를 악물고 단추를 풀던 이선은 올리비아와 눈이 마주치자 어디서 본 얼굴 같아 손을 멈춘다. 올리비아가 그를 골라 손을 잡는 순간, 두 손목에 운명의 짝 표식인 은빛 덩굴이 피어난다. 이선은 속으로 그 소녀가 검은 머리 공주일 리 없다며 소매로 표식을 덮는다.</w:t>
       </w:r>
     </w:p>
     <w:p>
@@ -4661,7 +4647,7 @@
           <w:b w:val="0"/>
           <w:sz w:val="21"/>
         </w:rPr>
-        <w:t>올리비아가 운명의 짝을 거부한 지 3개월이 지나도, 이선은 그녀의 가디언 자리를 떠나지 않는다. 그날 제나는 창틀에 올라서서, 다리를 못 쓴다는 소문이 도는 밤 엘프 왕국의 군주 가브리엘에게 시집가느니 뛰어내리겠다고 소리친다. 아버지인 국왕은 오래전에 맺은 혼약이라 어쩔 수 없다고 하고, 새엄마 다이앤은 휠체어 신세인 남자에게 왜 내 딸을 보내냐며 딸이 하나 더 있지 않냐고 따진다. 국왕이 올리비아에게는 이미 운명의 짝이 있다고 머뭇거리자, 제나는 왜 나만 불구에게 던져지냐고, 아빠는 맨날 언니 편만 든다고 울부짖는다.</w:t>
+        <w:t>소매 밑에 표식을 감춘 채, 이선은 3년 동안 매일 아침 올리비아의 드레스 끈을 묶어 주고 올리비아는 그 손길을 사랑이라 믿는다. 결속의 입맞춤 의식에서 이선은 네 생각뿐이라며 입술을 내리다 다른 이름을 부른다. 「나의 사랑, 제나.」 올리비아가 먼저 그를 밀어낸다. 「이선 군주, 당신을 거부하겠어.」</w:t>
       </w:r>
     </w:p>
     <w:p>
@@ -4675,7 +4661,7 @@
           <w:b w:val="0"/>
           <w:sz w:val="21"/>
         </w:rPr>
-        <w:t>그 연극을 보다 못한 올리비아가 그렇게 죽고 싶으면 도와주겠다며 제나를 창틀 쪽으로 끌어당긴다. 이선은 어떻게 동생한테 이럴 수 있냐고 올리비아에게 소리친다. 올리비아는 눈물을 흘리면서도, 내연녀의 딸 따위는 자기 동생이 될 자격이 없다고 잘라 말한다. 그리고 모두를 돌아본다. 「그 정략결혼, 내가 하겠어.」</w:t>
+        <w:t>3개월 뒤, 제나는 창틀에 올라서서 다리를 못 쓴다는 소문이 도는 밤 엘프 왕국의 군주 가브리엘에게 시집가느니 뛰어내리겠다고 소리친다. 아버지인 국왕은 오래전 혼약이라 어쩔 수 없다고 하고, 새엄마 다이앤은 딸이 하나 더 있지 않냐고 따진다. 국왕이 올리비아에게는 이미 운명의 짝이 있다고 머뭇거리자, 제나는 왜 나만 불구에게 던져지냐고, 아빠는 맨날 언니 편만 든다고 울부짖는다. 그 엄살을 보다 못한 올리비아가 제나의 팔을 잡아 창틀 쪽으로 끌어당긴다. 「죽고 싶어? 그럼 내가 도와줄게!」 이선이 어떻게 동생한테 이럴 수 있냐고 소리치자, 올리비아가 잘라 말한다. 「내연녀의 딸 따위는 내 동생이 될 자격 없어. 그 정략결혼, 내가 하겠어.」</w:t>
       </w:r>
     </w:p>
     <w:p>
@@ -4818,7 +4804,7 @@
           <w:b w:val="0"/>
           <w:sz w:val="21"/>
         </w:rPr>
-        <w:t>가게 주인까지 제발 여기서 벗어 달라고 고개를 숙이는 동안, 이선은 아무 말도 하지 않는다. 3년 전 올리비아가 직접 골라 왕궁에 들인 그 가디언이, 이제 제나를 위해 그녀를 사람들 앞에서 벗기려 한다. 올리비아는 어깨끈을 끌어내리며, 아직도 언니가 쓰다 버린 것만 탐내냐고 제나에게 웃어 보이고 커튼 뒤로 들어간다.</w:t>
+        <w:t>가게 주인까지 제발 여기서 벗어 달라고 고개를 숙이는 동안, 이선은 아무 말도 하지 않는다. 3년 전 올리비아가 직접 골라 왕궁에 들인 그 가디언이, 이제 제나를 위해 그녀를 사람들 앞에서 벗기려 한다. 올리비아는 물러서지 않고 그 자리에서 자기 손으로 어깨끈을 끌어내리며 이선을 똑바로 보고 웃는다. 「축하해, 제나. 이선 군주는 정말 지독한 충견이네.」</w:t>
       </w:r>
     </w:p>
     <w:p>
@@ -4961,7 +4947,7 @@
           <w:b w:val="0"/>
           <w:sz w:val="21"/>
         </w:rPr>
-        <w:t>올리비아가 그건 우리 엄마 물건이라고 맞서자, 부관은 거절하면 목걸이를 지금 당장 부수겠다고 한다. 제나가 팔짱을 끼고 웃는 앞에서 올리비아는 연회장 한가운데 무릎을 꿇고, 맞을 거면 자기 채찍으로 맞겠다며 승마 채찍을 풀어 내민다.</w:t>
+        <w:t>올리비아가 그건 우리 엄마 물건이라고 맞서자, 부관은 거절하면 목걸이를 지금 당장 부수겠다고 한다. 제나가 팔짱을 끼고 이제 대가를 치를 거라며 웃자, 올리비아는 눈 하나 깜빡하지 않는다. 「좋아, 무릎 꿇을게.」 연회장 한가운데 무릎을 꿇은 올리비아는 허리에 찬 승마 채찍을 풀어 부관에게 내민다. 「내 채찍을 써.」</w:t>
       </w:r>
     </w:p>
     <w:p>
@@ -5004,7 +4990,7 @@
           <w:b w:val="0"/>
           <w:sz w:val="21"/>
         </w:rPr>
-        <w:t>제나는 무릎 꿇은 올리비아의 눈앞에 목걸이를 흔들며 갖고 싶냐고 묻고, 돌려 달라고 비는 올리비아에게 네 엄마도 죽기 전에 이렇게 한심했냐고 비웃는다. 네 엄마가 우리 엄마한테 졌듯 너도 나한테 안 된다며, 넌 영원히 내 발밑의 개라고 말한 제나는 목걸이를 바닥에 내리쳐 부순다.</w:t>
+        <w:t>제나는 무릎 꿇은 올리비아의 눈앞에 목걸이를 흔들며 갖고 싶냐고 묻고, 울며 돌려 달라는 올리비아에게 네 엄마도 죽기 전에 이렇게 한심했냐고 비웃는다. 네 엄마가 우리 엄마한테 졌듯 너도 나한테 안 된다며, 넌 영원히 내 발밑의 개라고 말한 제나는 목걸이를 바닥에 내리쳐 부순다.</w:t>
       </w:r>
     </w:p>
     <w:p>
@@ -5075,7 +5061,7 @@
           <w:color w:val="6B6B6B"/>
           <w:sz w:val="18"/>
         </w:rPr>
-        <w:t>08 · 원작 DramaWave &lt;The Silver Angel He Never Recognized&gt; · 세트 B (하이틴 · 늑대인간 성채 아카데미)</w:t>
+        <w:t>08 · 원작 DramaWave &lt;The Silver Angel He Never Recognized&gt; · 세트 B (오빠들 · 늑대인간 왕궁 팩)</w:t>
       </w:r>
     </w:p>
     <w:p>
@@ -5091,7 +5077,7 @@
           <w:color w:val="1F3A5F"/>
           <w:sz w:val="34"/>
         </w:rPr>
-        <w:t>[T1] Rejected at Moon Academy</w:t>
+        <w:t>[T1] My Brothers and My Mate Chose Her</w:t>
       </w:r>
     </w:p>
     <w:p>
@@ -5252,7 +5238,7 @@
           <w:b w:val="0"/>
           <w:sz w:val="21"/>
         </w:rPr>
-        <w:t xml:space="preserve">  #Rejected Mate, Werewolf, Academy, Hidden Identity</w:t>
+        <w:t xml:space="preserve">  #Rejected Mate, Werewolf, Family Betrayal, All Too Late</w:t>
       </w:r>
     </w:p>
     <w:p>
@@ -5282,7 +5268,7 @@
           <w:b w:val="0"/>
           <w:sz w:val="21"/>
         </w:rPr>
-        <w:t>늑대가 깨어나지 않아 아카데미의 놀림감이 된 알파의 딸이, 3년을 곁에 둔 가디언에게 각인 직전 이복동생의 이름으로 불리자 그를 거부하고, 휠체어를 탄다는 다른 팩 후계자와의 정략결혼을 자청해, 끝내 하얀 늑대로 깨어나 휠체어에서 일어선 그 남자의 루나가 되는 이야기.</w:t>
+        <w:t>늑대가 깨어나지 않아 친오빠 셋에게 팩의 수치로 불리는 막내 공주가, 이복동생의 이름을 부른 메이트를 거부하고, 오빠들이 이복동생 대신 보내려는 다리 못 쓰는 다른 팩 후계자와의 정략결혼을 스스로 받아들여, 짓밟힐 때마다 되받아치다 끝내 하얀 늑대로 깨어나 휠체어에서 일어선 그 남자의 루나가 되는 이야기.</w:t>
       </w:r>
     </w:p>
     <w:p>
@@ -5313,7 +5299,7 @@
           <w:b w:val="0"/>
           <w:sz w:val="21"/>
         </w:rPr>
-        <w:t>1. 평생 찾던 은빛 소녀를 곁에 두고도 몰라본 메이트, 그 메이트를 먼저 거부하는 진짜 은빛 소녀</w:t>
+        <w:t>1. 짓밟혀도 매달리지 않고 되받아치는 걸크러시 여주, 양산형 전개를 깨는 반응</w:t>
       </w:r>
     </w:p>
     <w:p>
@@ -5328,7 +5314,7 @@
           <w:b w:val="0"/>
           <w:sz w:val="21"/>
         </w:rPr>
-        <w:t>2. 거절당한 메이트의 후회물 정석</w:t>
+        <w:t>2. 막내를 지키겠다던 친오빠 셋이 이복동생만 감싸는 가족 배신으로 시청자 자극, 오빠들과 메이트의 후회물 정석</w:t>
       </w:r>
     </w:p>
     <w:p>
@@ -5343,7 +5329,7 @@
           <w:b w:val="0"/>
           <w:sz w:val="21"/>
         </w:rPr>
-        <w:t>3. 늑대도 못 깨운 낙오 후계자의 각성과 신분 역전</w:t>
+        <w:t>3. 자기가 찾던 은빛 소녀를 몰라보는 메이트와 휠체어에서 일어서는 정혼자, 히든 아이덴티티의 정석</w:t>
       </w:r>
     </w:p>
     <w:p>
@@ -5358,7 +5344,7 @@
           <w:b w:val="0"/>
           <w:sz w:val="21"/>
         </w:rPr>
-        <w:t>4. 왕궁 팩 ㅡ&gt; 늑대인간 왕국의 성채 아카데미 치환, 하이틴 캠퍼스로 접근성 UP</w:t>
+        <w:t>4. 아버지·새엄마 ㅡ&gt; 이복동생만 감싸는 친오빠 셋 치환</w:t>
       </w:r>
     </w:p>
     <w:p>
@@ -5403,7 +5389,7 @@
           <w:b w:val="0"/>
           <w:sz w:val="21"/>
         </w:rPr>
-        <w:t>알파의 딸이자 스톤리지 팩 후계자지만 늑대가 깨어나지 않은 열아홉 살 그레이스 콜린스. 성채 학교 문 아카데미 입학식 날, 후계자가 가디언을 고르는 전통에 따라 웃통 벗은 후보들이 늘어선다. 은발의 이복동생 앰버는 언니가 남자를 고르러 나왔다고 비웃는다. 혼자 셔츠를 입은 남자는, 어릴 적 자신을 구한 은빛 소녀를 찾으러 신분을 숨긴 하이랜드 팩 알파 로건이다. 벗으라는 그레이스에게, 로건은 종마가 되러 온 게 아니라고 맞선다. 그레이스가 그를 고르며 손을 잡는 순간, 두 사람의 목덜미에 메이트 표식이 뜬다. 로건은 검은 머리 그레이스가 은빛 소녀일 리 없다며 셔츠 깃으로 표식을 가린다. 그 소녀가 그레이스라는 걸 로건은 모른다.</w:t>
+        <w:t>스톤리지 팩에서 혼자 늑대가 깨어나지 않아, 친오빠 셋에게 팩의 수치로 불리는 열아홉 살 검은 머리 막내 공주 그레이스 콜린스. 가디언을 고르는 날 그레이스가 잔뜩 삐진 얼굴로 나서자, 은발의 이복동생 앰버는 가디언을 고르는 거냐 애인을 쇼핑하는 거냐며 비웃고, 오빠 셋이 따라 웃는다. 웃통 벗은 후보들 가운데 혼자 셔츠를 입은 남자는, 신분을 숨긴 하이랜드 팩 알파 로건이다. 로건은 어릴 적 자기를 구한 은빛 소녀가 여기 있을지 몰라 숨어든 것이지, 철없는 공주 비위나 맞추러 온 게 아니라고 속으로 되뇐다. 그 소녀가 그레이스라는 걸 로건은 모른다.</w:t>
       </w:r>
     </w:p>
     <w:p>
@@ -5417,7 +5403,7 @@
           <w:b w:val="0"/>
           <w:sz w:val="21"/>
         </w:rPr>
-        <w:t>3년 동안 로건은 매일 그레이스의 망토 끈을 매 주고, 그레이스는 그 손길을 사랑이라 믿는다. 졸업반이 된 밤, 그가 하이랜드 팩 알파라고 동기들이 수군대는 각인식에서 로건은 네 생각뿐이라며 목덜미에 입술을 대다 다른 이름을 부른다. 「나의 사랑, 앰버.」 그레이스가 그를 밀어낸다. 「나 그레이스 콜린스는, 로건을 내 메이트로 거부한다.」</w:t>
+        <w:t>그레이스가 로건을 가리킨다. 「너, 왜 아직 옷을 입고 있지?」 로건은 가디언으로 일하러 왔지 종마 취급을 받으러 온 게 아니라고 맞선다. 그레이스는 물러서지 않는다. 「벗어.」 어디서 본 듯한 얼굴에 로건이 순간 멈칫하고, 그레이스는 그를 고르며 손을 잡는다. 그 순간 두 사람 목덜미에 메이트 표식이 뜬다. 로건은 셔츠 깃으로 표식을 가리며, 자기가 찾던 은빛 소녀가 검은 머리 그레이스일 리 없다고 속으로 부정한다.</w:t>
       </w:r>
     </w:p>
     <w:p>
@@ -5446,7 +5432,7 @@
           <w:b w:val="0"/>
           <w:sz w:val="21"/>
         </w:rPr>
-        <w:t>그레이스가 메이트를 거부한 지 3개월이 지나도, 로건은 그녀의 가디언 자리를 떠나지 않는다. 그날 앰버는 아카데미 탑의 창틀에 올라서서, 휠체어를 탄다는 섀도우밸리 팩의 알파 후계자 네이선과 결혼하느니 뛰어내리겠다고 소리친다. 스톤리지 팩의 알파인 아버지는 오래전에 맺은 팩 동맹이라 어쩔 수 없다고 하고, 새엄마 린다는 휠체어 신세인 남자에게 왜 내 딸을 보내냐며 딸이 하나 더 있지 않냐고 따진다. 아버지가 그레이스에게는 이미 메이트가 있다고 머뭇거리자, 앰버는 왜 나만 불구에게 던져지냐고, 아빠는 맨날 언니 편만 든다고 울부짖는다.</w:t>
+        <w:t>그날부터 3년 동안 로건은 매일 아침 그레이스의 코르셋 끈을 묶어 주고, 그레이스는 그 손길을 사랑이라 믿는다. 알파인 큰오빠 헨리와 둘째 데이비드, 셋째 스콧이 지켜보는 각인식 날, 로건은 네 생각뿐이라며 그레이스의 목덜미에 입술을 대다 앰버의 이름을 부른다. 그레이스가 로건을 밀어낸다. 「나 그레이스 콜린스는, 로건을 내 메이트로 거부한다.」</w:t>
       </w:r>
     </w:p>
     <w:p>
@@ -5460,7 +5446,7 @@
           <w:b w:val="0"/>
           <w:sz w:val="21"/>
         </w:rPr>
-        <w:t>그 연극을 보다 못한 그레이스가 그렇게 죽고 싶으면 도와주겠다며 앰버를 창틀 쪽으로 끌어당긴다. 로건은 어떻게 동생한테 이럴 수 있냐고 그레이스에게 소리친다. 그레이스는 눈물을 흘리면서도, 내연녀의 딸 따위는 자기 동생이 될 자격이 없다고 잘라 말한다. 그리고 모두를 돌아본다. 「그 정략결혼, 내가 할게.」</w:t>
+        <w:t>3개월 뒤, 앰버는 왕궁 탑 창틀에 올라서서 다리를 못 쓴다는 섀도우밸리 팩의 알파 후계자 네이선에게 시집가느니 뛰어내리겠다고 소리친다. 헨리가 죽은 아버지가 맺은 혼약이라 깰 수 없다고 하자, 새엄마 린다는 딸이 하나 더 있지 않냐고 따지고, 오빠 셋은 늑대도 없는 막내를 보내면 되겠다며 그레이스를 쳐다본다. 그레이스는 성큼 다가가 앰버의 팔을 잡고 창틀 쪽으로 끌어당긴다. 「죽고 싶어? 그럼 내가 도와줄게!」 아직 가디언 자리를 지키던 로건과 오빠 셋이 동생한테 어떻게 이럴 수 있냐고 소리치자, 그레이스가 앰버를 놓고 그들을 돌아본다. 「내연녀의 딸 따위는 내 동생이 될 자격 없어. 그 정략결혼, 내가 할게.」</w:t>
       </w:r>
     </w:p>
     <w:p>
@@ -5489,7 +5475,7 @@
           <w:b w:val="0"/>
           <w:sz w:val="21"/>
         </w:rPr>
-        <w:t>그레이스가 정략결혼을 자청한 그날 밤, 로건은 은빛 소녀라고 믿는 앰버에게 줄 은빛 티아라를 받아 든다. 베타가 앰버라면 아주 좋아할 거라고 하자, 로건은 그녀는 최고를 누릴 자격이 있다며 미소 짓는다.</w:t>
+        <w:t>그레이스가 정략결혼을 받아들인 그날 밤, 로건은 은빛 소녀라고 믿는 앰버에게 줄 은빛 티아라를 받아 든다. 로건의 베타가 앰버라면 아주 좋아할 거라고 하자, 로건은 그녀는 최고를 누릴 자격이 있다며 미소 짓는다.</w:t>
       </w:r>
     </w:p>
     <w:p>
@@ -5503,7 +5489,7 @@
           <w:b w:val="0"/>
           <w:sz w:val="21"/>
         </w:rPr>
-        <w:t>시간은 어린 로건이 숲에서 다쳐 울던 날로 돌아간다. 은빛 드레스를 입은 소녀가 다가와 그를 일으켰고, 어린 로건이 달의 여신이 보낸 거냐고 묻자 소녀는 엄마가 부른다며 이름도 말하지 않고 사라졌다. 그 소녀가 어린 그레이스였다는 걸 로건은 지금도 모른다.</w:t>
+        <w:t>시간은 어린 로건이 숲에서 다쳐 울던 날로 돌아간다. 은빛 드레스를 입은 소녀가 다가와 그를 일으켰고, 어린 로건이 달의 여신이 보낸 거냐고 묻자 소녀는 엄마가 부른다며 이름도 말하지 않고 사라졌다. 그 소녀가 어린 그레이스였다는 걸 로건은 모른다.</w:t>
       </w:r>
     </w:p>
     <w:p>
@@ -5517,7 +5503,7 @@
           <w:b w:val="0"/>
           <w:sz w:val="21"/>
         </w:rPr>
-        <w:t>다음 날 그레이스는 팩 상점가로 마차를 대라고 명하고, 바쁘다는 로건에게 아직 자기 가디언이라는 걸 잊지 말라며 명령이라고 못 박는다. 앰버가 끼어들어 아무도 데려가 주지 않는다고 울상을 짓자, 로건은 앰버는 충분히 고생했다며 그녀를 마차에 태우고 떠난다. 혼자 드레스 가게에 들어선 그레이스를 본 로건이 메이트에게 줄 선물이라도 고르냐고 묻는다. 그레이스는 자기에게는 메이트가 없다며, 졸업반 문 볼에서 치를 메이트 의식 드레스를 고른다고 답한다. 그제야 그 선언이 진심이었다는 걸 안 로건이 묻는다. 「결혼한다고?」</w:t>
+        <w:t>다음 날 그레이스는 왕궁 상점가로 마차를 대라고 명하고, 바쁘다는 로건에게 아직 자기 가디언이라는 걸 잊지 말라며 명령이라고 못 박는다. 앰버가 끼어들어 아무도 데려가 주지 않는다고 울상을 짓자, 로건은 앰버는 충분히 고생했다며 그녀를 마차에 태우고 떠난다. 혼자 드레스 가게에 들어선 그레이스를 본 로건이 메이트에게 줄 선물이라도 고르냐고 묻는다. 그레이스는 자기에게는 메이트가 없다며, 네이선과의 메이트 의식 때 입을 드레스를 고른다고 답한다. 그제야 그 말이 진심이었다는 걸 안 로건이 묻는다. 「결혼한다고?」</w:t>
       </w:r>
     </w:p>
     <w:p>
@@ -5546,7 +5532,7 @@
           <w:b w:val="0"/>
           <w:sz w:val="21"/>
         </w:rPr>
-        <w:t>그레이스는 대답 대신 점원이 달빛 실크로 짰다는 은빛 드레스를 집어 든다. 앰버가 은색은 언제나 자기 색이었다며 이번에도 빼앗을 거냐고 막아서자, 로건까지 은색은 앰버의 색이라 검은 머리에는 안 어울린다고 거든다.</w:t>
+        <w:t>그레이스는 대답 대신 달빛 실크로 짠 은빛 드레스를 집어 든다. 앰버가 은색은 언제나 자기 색이었다며 이번에도 빼앗을 거냐고 막아서자, 로건까지 은색은 앰버의 색이라 검은 머리에는 안 어울린다고 거든다.</w:t>
       </w:r>
     </w:p>
     <w:p>
@@ -5560,7 +5546,7 @@
           <w:b w:val="0"/>
           <w:sz w:val="21"/>
         </w:rPr>
-        <w:t>어린 시절, 앰버는 멍든 얼굴로 언니가 은색을 빼앗고 자기를 때렸다고 울었다. 린다는 안 그랬다는 그레이스의 말은 듣지도 않고, 앞으로 은색은 아무것도 쓰지 말라고 했다. 그날 이후 그레이스는 한 번도 은색을 입지 못했다.</w:t>
+        <w:t>어린 시절, 앰버는 멍든 얼굴로 언니가 은색을 빼앗고 자기를 때렸다고 울었다. 오빠 셋은 안 그랬다는 그레이스의 말은 듣지도 않고 앰버만 달랬고, 린다는 앞으로 은색은 아무것도 쓰지 말라고 했다. 그날 이후 그레이스는 한 번도 은색을 입지 못했다.</w:t>
       </w:r>
     </w:p>
     <w:p>
@@ -5574,7 +5560,7 @@
           <w:b w:val="0"/>
           <w:sz w:val="21"/>
         </w:rPr>
-        <w:t>그레이스가 어차피 은색은 질색이라며 빨간 드레스를 고르는 사이, 은빛 드레스를 입은 앰버를 본 로건은 그 소녀가 입었던 색인데 왜 그때처럼 떨리지 않는지 모른다. 빨간 드레스를 입고 나온 그레이스에게서 로건이 눈을 떼지 못하자, 앰버가 자기도 그 드레스를 갖고 싶다며 로건에게 매달린다. 그레이스가 넌 언니 것에만 관심이 있냐고 쏘아붙이는데, 가게 주인이 달려와 로건 알파가 가게를 통째로 샀다며 앰버에게 고개를 숙인다. 앰버는 언니가 입은 것도 포함이냐고 묻고, 물론이라는 대답에 웃는다. 「그럼 언니더러 여기서 당장 벗으라고 해요.」</w:t>
+        <w:t>그레이스가 어차피 은색은 질색이라며 빨간 드레스를 고르는 사이, 은빛 드레스를 입은 앰버를 본 로건은 그 소녀가 입었던 색인데 왜 그때처럼 떨리지 않는지 모른다. 빨간 드레스를 입고 나온 그레이스에게서 로건이 눈을 떼지 못하자, 앰버가 자기도 그 드레스를 갖고 싶다며 로건에게 매달린다. 그레이스가 넌 언니 것에만 관심이 있냐고 쏘아붙이는데, 가게 주인이 로건 알파가 가게를 통째로 샀다며 앰버에게 고개를 숙인다. 앰버는 언니가 입은 것도 포함이냐고 묻고, 물론이라는 대답에 웃는다. 「그럼 언니더러 여기서 당장 벗으라고 해요.」</w:t>
       </w:r>
     </w:p>
     <w:p>
@@ -5603,7 +5589,7 @@
           <w:b w:val="0"/>
           <w:sz w:val="21"/>
         </w:rPr>
-        <w:t>가게 주인까지 제발 여기서 벗어 달라고 고개를 숙이는 동안, 로건은 아무 말도 하지 않는다. 3년 전 그레이스가 직접 골라 곁에 둔 그 가디언이, 이제 앰버를 위해 그녀를 사람들 앞에서 벗기려 한다. 그레이스는 어깨끈을 끌어내리며, 아직도 언니가 쓰다 버린 것만 탐내냐고 앰버에게 웃어 보이고 커튼 뒤로 들어간다.</w:t>
+        <w:t>가게 주인까지 제발 여기서 벗어 달라고 고개를 숙이는 동안, 로건은 아무 말도 하지 않는다. 그레이스는 어깨끈을 직접 끌어내리며, 3년 전 자기가 골라 곁에 둔 가디언이 이제 앰버를 위해 자기를 사람들 앞에서 벗기냐고 로건을 비웃는다. 「축하해, 앰버. 로건 알파는 정말 지독한 충견이네.」 드레스를 벗어 앰버의 발밑에 던진 그레이스는 아직도 언니가 쓰다 버린 것만 탐내냐고 앰버에게 웃어 보인다.</w:t>
       </w:r>
     </w:p>
     <w:p>
@@ -5617,7 +5603,7 @@
           <w:b w:val="0"/>
           <w:sz w:val="21"/>
         </w:rPr>
-        <w:t>그날 밤 아카데미의 보름달 생존 시험이 열린 숲, 그레이스와 로건, 억지로 따라붙은 앰버까지 세 사람을 로그 늑대들이 에워싼다. 로건에게 형제들을 잃은 무리의 우두머리는 두 여자의 목을 꺾는 건 순식간이지만, 로건에게는 한 명만 구할 시간이 있다며, 그에게 3년을 바친 그레이스와 그가 사랑하는 앰버 중 하나를 고르라고 한다. 그레이스가 로건의 이름을 부르며 살려 달라고 외치고 앰버가 죽기 싫다고 울부짖자, 우두머리가 웃는다. 「골라. 누가 살지?」</w:t>
+        <w:t>그날 왕궁으로 돌아오는 숲길에서 마차가 뒤집히고, 로건에게 형제들을 잃은 로그 늑대 무리가 세 사람을 에워싼다. 우두머리는 두 여자의 목을 꺾는 건 순식간이지만 로건에게는 한 명만 구할 시간이 있다며, 그에게 3년을 바친 그레이스와 그가 사랑하는 앰버 중 하나를 고르라고 한다. 그레이스가 로건의 이름을 부르며 살려 달라고 외치고 앰버가 죽기 싫다고 울부짖자, 우두머리가 웃는다. 「골라. 누가 살지?」</w:t>
       </w:r>
     </w:p>
     <w:p>
@@ -5703,7 +5689,7 @@
           <w:b w:val="0"/>
           <w:sz w:val="21"/>
         </w:rPr>
-        <w:t>네이선이 길을 나선 그 무렵, 아카데미 대강당에서는 앰버의 생일 파티가 열린다. 학생들은 은발에 하얀 늑대 혈통을 타고났으니 로건 알파가 앰버를 고를 만하다고 치켜세운다. 상처가 채 아물지 않은 몸으로 들어선 그레이스를 두고는, 늑대로 변신도 못 하는 데다 자기 가디언까지 꼬셨다고 수군거린다. 숲에서 그레이스의 등 뒤로 일어선 하얀 늑대를 본 사람은 로건뿐이다. 로건이 앰버에게 세상에 셋뿐인 얼음 수정 반지를 끼워 주자 학생들이 탄성을 지르고, 로건의 베타는 그레이스에게도 선물이 있다며 상자를 연다.</w:t>
+        <w:t>네이선이 길을 나선 그 무렵, 왕궁 대연회장에서는 앰버의 생일 연회가 열린다. 헨리는 은발에 하얀 늑대 혈통을 타고난 앰버가 팩의 자랑이라며 잔을 들고, 하객들은 로건 알파가 앰버를 고를 만하다고 치켜세운다. 상처가 채 아물지 않은 몸으로 들어선 그레이스에게 오빠 셋은, 늑대도 못 깨운 주제에 앰버까지 다치게 했다며 눈길도 주지 않는다. 숲에서 그레이스의 등 뒤로 일어선 하얀 늑대를 본 사람은 로건뿐이다. 로건이 앰버에게 세상에 셋뿐인 얼음 수정 반지를 끼워 주자 하객들이 탄성을 지르고, 베타는 그레이스에게도 선물이 있다며 상자를 연다.</w:t>
       </w:r>
     </w:p>
     <w:p>
@@ -5717,7 +5703,7 @@
           <w:b w:val="0"/>
           <w:sz w:val="21"/>
         </w:rPr>
-        <w:t>상자 안에는 린다가 훔쳐다 판 엄마의 유일한 유품, 파란 수정 목걸이가 들어 있다. 그레이스가 이리 달라고 손을 뻗자, 베타는 로건 알파의 명령이라며 상자를 거둔다. 「돌려받고 싶으면 팩 법정의 옛 법대로 하십시오. 숲에서 다치게 한 앰버 님께 무릎 꿇고 사과한 뒤, 채찍 50대를 맞으십시오.」</w:t>
+        <w:t>상자 안에는 린다가 훔쳐다 판 엄마의 유일한 유품, 파란 수정 목걸이가 들어 있다. 오빠 셋도 엄마의 목걸이를 알아보지만 아무도 나서지 않는다. 그레이스가 이리 달라고 손을 뻗자, 베타는 로건 알파의 명령이라며 상자를 거둔다. 「돌려받고 싶으면 숲에서 다치게 한 앰버 님께 무릎 꿇고 사과하십시오. 그다음 채찍 50대를 맞으십시오.」</w:t>
       </w:r>
     </w:p>
     <w:p>
@@ -5746,7 +5732,7 @@
           <w:b w:val="0"/>
           <w:sz w:val="21"/>
         </w:rPr>
-        <w:t>그레이스가 그건 우리 엄마 물건이라고 맞서자, 베타는 거절하면 목걸이를 지금 당장 부수겠다고 한다. 앰버가 팔짱을 끼고 웃는 앞에서 그레이스는 대강당 한가운데 무릎을 꿇는다.</w:t>
+        <w:t>그레이스가 그건 우리 엄마 물건이라며 오빠들을 돌아보지만, 헨리는 앰버를 다치게 했으면 맞아도 싸다고 한다. 베타가 거절하면 목걸이를 지금 당장 부수겠다고 하자, 그레이스는 앰버를 똑바로 본다. 「좋아, 무릎 꿇을게.」 연회장 한가운데 무릎을 꿇은 그레이스가 승마 채찍을 풀어 베타에게 내민다. 「맞을 거면, 내 채찍을 써.」</w:t>
       </w:r>
     </w:p>
     <w:p>
@@ -5760,7 +5746,7 @@
           <w:b w:val="0"/>
           <w:sz w:val="21"/>
         </w:rPr>
-        <w:t>베타가 팩 법정의 채찍을 내리칠 때마다 그레이스는 숫자를 직접 센다. 하나, 둘, 그리고 쉰 번째 채찍에 로건이 눈을 감는다. 피 묻은 손을 짚고 겨우 고개를 든 그레이스에게 앰버는 손뼉을 치며, 그걸 다 맞고도 살아 있다니 장하다고 웃는다. 그레이스가 엄마를 부르며 목걸이로 손을 뻗자, 앰버가 먼저 목걸이를 집어 든다. 「이게 언니 거라고 누가 그래?」</w:t>
+        <w:t>베타가 그 채찍을 내리칠 때마다 그레이스는 하나, 둘, 숫자를 직접 세고, 오빠 셋은 끝까지 말리지 않는다. 그리고 쉰 번째 채찍에 로건이 눈을 감는다. 피 묻은 손을 짚고 고개를 든 그레이스에게 앰버는 손뼉을 치며, 그걸 다 맞고도 살아 있다니 장하다고 웃는다. 그레이스가 엄마를 부르며 목걸이로 손을 뻗자, 앰버가 먼저 목걸이를 집어 든다. 「이게 언니 거라고 누가 그래?」</w:t>
       </w:r>
     </w:p>
     <w:p>
@@ -5789,7 +5775,7 @@
           <w:b w:val="0"/>
           <w:sz w:val="21"/>
         </w:rPr>
-        <w:t>앰버는 무릎 꿇은 그레이스의 눈앞에 목걸이를 흔들며 갖고 싶냐고 묻고, 돌려 달라고 비는 그레이스에게 네 엄마도 죽기 전에 이렇게 한심했냐고 비웃는다. 네 엄마가 우리 엄마한테 졌듯 너도 나한테 안 된다며, 넌 영원히 내 발밑의 개라고 말한 앰버는 목걸이를 바닥에 내리쳐 부순다.</w:t>
+        <w:t>앰버는 무릎 꿇은 그레이스의 눈앞에 목걸이를 흔들며 갖고 싶냐고 묻고, 울며 돌려 달라는 그레이스에게 네 엄마도 죽기 전에 이렇게 한심했냐고 비웃는다. 자기들 엄마 이야기인데도 오빠 셋은 입을 다문다. 네 엄마가 우리 엄마한테 졌듯 너도 나한테 안 되고 넌 영원히 내 발밑의 개라며, 앰버가 목걸이를 바닥에 내리쳐 부순다.</w:t>
       </w:r>
     </w:p>
     <w:p>
@@ -5803,7 +5789,7 @@
           <w:b w:val="0"/>
           <w:sz w:val="21"/>
         </w:rPr>
-        <w:t>엄마는 그 목걸이를 걸어 주며 자기가 지켜 주지 못할 때 이게 지켜 줄 거라고 했고, 어린 그레이스는 목걸이 말고 엄마가 필요하다고 울었다.</w:t>
+        <w:t>엄마는 그 목걸이를 걸어 주며 자기가 지켜 주지 못할 때 이게 지켜 줄 거라고 했고, 그 곁에서 오빠 셋은 막내는 자기들이 지키겠다고 약속했다.</w:t>
       </w:r>
     </w:p>
     <w:p>
@@ -5817,7 +5803,7 @@
           <w:b w:val="0"/>
           <w:sz w:val="21"/>
         </w:rPr>
-        <w:t>부서진 조각 앞에서 그레이스가 앰버를 죽여 버리겠다며 달려든다. 로건은 자기 메이트 표식이 뜬 그레이스의 목을 움켜잡고, 앰버를 얼마나 더 괴롭혀야 속이 시원하냐고 소리친다. 학생들까지 저 미친 여자를 죽이라고 외치는 가운데, 목이 졸린 그레이스가 로건을 본다. 「당신을 사랑했던 걸 후회해.」 그 순간 누군가 로건의 손을 떼어 내고 그레이스를 감싸 안는다. 검은 머리의 그 남자를 그레이스도, 대강당의 누구도 본 적이 없다. 카메라가 그의 금빛 눈을 가까이 잡는다. 「감히 내 루나에게 손을 대?」</w:t>
+        <w:t>부서진 조각 앞에서 그레이스가 앰버를 죽여 버리겠다며 달려든다. 로건은 메이트 표식이 뜬 그레이스의 목을 움켜잡고, 앰버를 얼마나 더 괴롭혀야 속이 시원하냐고 소리친다. 오빠 셋이 앰버만 감싸 안고 보는 가운데, 목이 졸린 그레이스가 로건을 본다. 「당신을 사랑했던 걸 후회해.」 그 순간 누구도 본 적 없는 검은 머리의 남자가 로건의 손을 떼어 내고 그레이스를 끌어안는다. 카메라가 그의 금빛 눈을 가까이 잡는다. 「감히 내 루나에게 손을 대?」</w:t>
       </w:r>
     </w:p>
     <w:p>
@@ -5860,7 +5846,7 @@
           <w:color w:val="6B6B6B"/>
           <w:sz w:val="18"/>
         </w:rPr>
-        <w:t>09 · 원작 DramaWave &lt;Fated Reunion: My Daddy Is The Crown Prince&gt; · 세트 A (크리스마스 판타지)</w:t>
+        <w:t>09 · 원작 DramaWave &lt;Fated Reunion: My Daddy Is The Crown Prince&gt; · 세트 A (용의 피 왕가)</w:t>
       </w:r>
     </w:p>
     <w:p>
@@ -5876,7 +5862,7 @@
           <w:color w:val="1F3A5F"/>
           <w:sz w:val="34"/>
         </w:rPr>
-        <w:t>[T1] The Crown Prince's Christmas Son</w:t>
+        <w:t>[T1] The Dragon Heir's Secret Son</w:t>
       </w:r>
     </w:p>
     <w:p>
@@ -6037,7 +6023,7 @@
           <w:b w:val="0"/>
           <w:sz w:val="21"/>
         </w:rPr>
-        <w:t xml:space="preserve">  #Secret Baby, Fake Relationship, Christmas Romance, Royalty</w:t>
+        <w:t xml:space="preserve">  #Secret Baby, Fake Relationship, Dragon, Royalty</w:t>
       </w:r>
     </w:p>
     <w:p>
@@ -6067,7 +6053,7 @@
           <w:b w:val="0"/>
           <w:sz w:val="21"/>
         </w:rPr>
-        <w:t>아버지와 오빠가 먹인 약에 취해 늙은 남작에게 팔려 가던 크리스마스이브에 도망쳐 왕세자와 하룻밤을 보낸 소녀가, 6년 뒤 서로를 알아보지 못한 그와 아들의 평생 약값을 조건으로 가짜 가족 계약을 맺고, 끝내 아들이 그의 친아들로 밝혀져 세 사람이 진짜 가족이 되는 이야기.</w:t>
+        <w:t>아버지와 오빠가 먹인 약에 취해 늙은 남작에게 팔려 가던 밤 도망쳐 용의 피를 잇는 왕세자와 하룻밤을 보낸 소녀가, 6년 뒤 서로를 알아보지 못한 그와 아들의 평생 약값을 조건으로 가짜 가족 계약을 맺고, 끝내 아들이 용 불꽃에 타지 않는 그의 친아들로 밝혀져 세 사람이 진짜 가족이 되는 이야기.</w:t>
       </w:r>
     </w:p>
     <w:p>
@@ -6098,7 +6084,7 @@
           <w:b w:val="0"/>
           <w:sz w:val="21"/>
         </w:rPr>
-        <w:t>1. 가짜 아빠를 연기하는 왕세자, 그 아이가 하룻밤에 생긴 친아들</w:t>
+        <w:t>1. 가짜 아빠를 연기하는 왕세자, 그 아이가 하룻밤에 생긴 친아들 ㅡ&gt; 시청자만 아는 핏줄 정보 비대칭</w:t>
       </w:r>
     </w:p>
     <w:p>
@@ -6128,7 +6114,22 @@
           <w:b w:val="0"/>
           <w:sz w:val="21"/>
         </w:rPr>
-        <w:t>3. 중세 판타지 ㅡ&gt; 크리스마스 판타지 치환, 북미 연말 시즌 소구</w:t>
+        <w:t>3. 천한 사생아라 비웃음받던 아이가 용 불꽃이 고른 진짜 후계자, 히든 아이덴티티 역전</w:t>
+      </w:r>
+    </w:p>
+    <w:p>
+      <w:pPr>
+        <w:keepNext w:val="0"/>
+        <w:spacing w:after="40" w:before="0" w:line="336" w:lineRule="auto"/>
+        <w:ind w:left="170"/>
+      </w:pPr>
+      <w:r>
+        <w:rPr>
+          <w:rFonts w:ascii="맑은 고딕" w:hAnsi="맑은 고딕" w:eastAsia="맑은 고딕" w:cs="맑은 고딕"/>
+          <w:b w:val="0"/>
+          <w:sz w:val="21"/>
+        </w:rPr>
+        <w:t>4. 중세 왕국 ㅡ&gt; 용의 피를 잇는 왕가 치환 (성화 시험 = 용 불꽃 시험)</w:t>
       </w:r>
     </w:p>
     <w:p>
@@ -6173,7 +6174,7 @@
           <w:b w:val="0"/>
           <w:sz w:val="21"/>
         </w:rPr>
-        <w:t>크리스마스이브 결혼식 날, 아버지 프랭크와 오빠 브록이 몰래 먹인 약에 취한 채 예순 살 남작에게 팔려 가던 열여덟 살 애나. 식장에서 도망친 애나가 눈보라 속을 내달리자, 프랭크는 횃불을 들고 쫓아오며 남작이 약속한 금화 천 닢을 날릴 셈이냐고 소리친다. 애나는 눈길을 지나던 왕실 마차에 매달려 살려 달라고 빈다. 마차에는 겨울마다 도지는 천식 약을 구하려고 몰래 궁을 빠져나온 왕세자 대니얼이 타고 있지만, 어떤 일에도 휘말리지 말라는 국왕의 명 때문에 마차는 다시 떠난다.</w:t>
+        <w:t>아버지 프랭크와 오빠 브록이 몰래 먹인 약에 취한 채, 금화 천 닢에 예순 살 남작에게 팔려 가던 열여덟 살 애나. 결혼식 날 밤 식장에서 도망친 애나는 겨울비 내리는 진흙길에서 지나가던 왕실 마차에 매달려 살려 달라고 빈다. 마차에는 용의 피를 잇는 왕가의 왕세자 대니얼이 타고 있다. 대니얼은 겨울마다 가슴 속 용의 불이 숨을 막는 불기침을 앓고, 그 약을 구하러 몰래 궁을 나온 길이다. 하지만 어떤 일에도 휘말리지 말라는 국왕의 명 때문에 마차는 다시 떠난다.</w:t>
       </w:r>
     </w:p>
     <w:p>
@@ -6187,7 +6188,7 @@
           <w:b w:val="0"/>
           <w:sz w:val="21"/>
         </w:rPr>
-        <w:t>혼자 남은 애나 앞을 프랭크와 브록이 막아서자, 애나는 눈밭에 주저앉아 딸을 금화 천 닢에 파는 아버지와 오빠가 어디 있느냐고 울부짖는다. 그 소리에 마차를 세운 대니얼은 자기 흔적은 남기지 말라며 화살을 쏘아 두 사람을 쫓아낸다. 약에 취한 애나는 자기를 구한 남자의 얼굴도, 그가 왕세자라는 것도 모른 채 대니얼의 옷깃을 움켜쥐고 더는 못 참겠다고 매달린다. 지금 무엇을 청하는지 아느냐는 대니얼의 물음에 애나가 안다고 답하자, 대니얼이 애나를 마차 안으로 끌어당긴다. 「그럼 후회하지 마시오.」</w:t>
+        <w:t>혼자 남은 애나를 뒤쫓아 온 프랭크와 브록이 붙잡자, 애나는 진흙탕에 주저앉아 딸을 금화 천 닢에 파는 아버지와 오빠가 어디 있느냐고 울부짖는다. 그 소리에 마차를 세운 대니얼은 자기 흔적은 남기지 말라며 화살을 쏘아 두 사람을 쫓아낸다. 약에 취한 애나는 자기를 구한 남자의 얼굴도, 그가 왕세자라는 것도 모른 채 대니얼의 옷깃을 움켜쥐고 더는 못 참겠다고 매달린다. 무엇을 청하는지 아느냐는 대니얼의 물음에 애나가 안다고 답하자, 대니얼이 애나를 마차 안으로 끌어당긴다. 「그럼 후회하지 마시오.」</w:t>
       </w:r>
     </w:p>
     <w:p>
@@ -6216,7 +6217,7 @@
           <w:b w:val="0"/>
           <w:sz w:val="21"/>
         </w:rPr>
-        <w:t>6년 뒤 크리스마스를 앞둔 시장, 진저브레드를 파는 애나는 천식을 앓는 다섯 살 아들 샘의 약값을 동전 한 닢씩 모은다. 구두를 닦던 샘은 동전 세 닢을 쥐고 달려와, 크리스마스엔 꼭 이 돈으로 아빠를 찾을 거라고 한다. 애나는 엄마도 네 아빠가 누군지 모른다며 샘을 끌어안는다. 샘의 목에는 그 밤의 남자가 남기고 간 반지가 걸려 있다. 언젠가 이 반지로 아빠가 샘을 알아볼 거라며 애나가 걸어 준 반지다. 그 남자가 왕세자 대니얼이라는 건 애나도 샘도 모른다.</w:t>
+        <w:t>6년 뒤 겨울 시장, 빵을 파는 애나는 불기침을 앓는 다섯 살 아들 샘의 약값을 동전 한 닢씩 모은다. 구두를 닦던 샘은 동전 세 닢을 쥐고 달려와, 이 돈은 아빠를 찾으려고 모으는 거라고 자랑한다. 애나는 엄마도 네 아빠가 누군지 모른다며 샘을 끌어안는다. 샘의 목에는 그 밤의 남자가 남기고 간 반지가 걸려 있다. 언젠가 이 반지로 아빠가 샘을 알아볼 거라며 애나가 걸어 준 반지다. 그 남자가 왕세자 대니얼이라는 건 애나도 샘도 모른다.</w:t>
       </w:r>
     </w:p>
     <w:p>
@@ -6230,7 +6231,7 @@
           <w:b w:val="0"/>
           <w:sz w:val="21"/>
         </w:rPr>
-        <w:t>그때 몽둥이를 든 프랭크와 브록이 나타나고, 브록은 사생아를 낳고 숨어 살더니 찾았다며 번 돈을 전부 내놓으라고 한다. 프랭크가 샘의 목덜미를 잡아 들어 올리고, 애나가 브록의 발에 매달려 샘의 약값이라고 빌자 브록은 천식은 귀족들이나 걸리는 병이라며 그럼 죽으라고 비웃는다. 찬 공기에 숨이 막힌 샘이 눈밭에 무릎을 꿇고 흩어진 동전을 긁어모으며 아빠를 부르자, 브록은 네 아빠는 보나 마나 거지라 절대 안 온다고 웃는다. 프랭크가 샘의 머리 위로 몽둥이를 치켜드는 순간, 누군가 소리친다. 「멈춰!」</w:t>
+        <w:t>그때 몽둥이를 든 프랭크와 브록이 나타나고, 브록은 사생아를 낳고 숨어 살더니 찾았다며 번 돈을 전부 내놓으라고 한다. 프랭크가 샘의 목덜미를 잡아 들어 올리고, 애나가 브록의 발에 매달려 샘의 약값이라고 빌자 브록은 불기침은 귀족들이나 걸리는 병이라며 그럼 죽으라고 비웃는다. 찬 바람에 불기침이 도진 샘이 바닥에 무릎을 꿇고 흩어진 동전을 긁어모으며 아빠를 부르자, 브록은 네 아빠는 보나 마나 거지라 절대 안 온다고 웃는다. 프랭크가 샘의 머리 위로 몽둥이를 치켜드는 순간, 누군가 소리친다. 「멈춰!」</w:t>
       </w:r>
     </w:p>
     <w:p>
@@ -6259,7 +6260,7 @@
           <w:b w:val="0"/>
           <w:sz w:val="21"/>
         </w:rPr>
-        <w:t>몽둥이를 멈춰 세운 사람은 대니얼이다. 숨이 넘어가 쓰러진 샘의 얼굴을 감싼 대니얼은 자기와 같은 천식이라며 품에서 꺼낸 약을 먹이고, 애나는 처음 보는 얼굴이 이상하게 낯익다. 숨이 돌아온 샘은 꿈에서 본 아빠랑 똑같다며 대니얼에게 안겨 아빠라고 부른다. 브록이 네가 정말 이 꼬맹이의 아비냐고 대들자, 호위가 이분은 왕세자 전하라고 호통친다. 애나가 말을 잇지 못하는 사이 대니얼이 나선다. 「그래, 내가 샘의 아버지다.」 대니얼은 내 아들을 또 건드리면 둘 다 지하 감옥에 처넣겠다며 프랭크와 브록을 쫓아 버린다.</w:t>
+        <w:t>몽둥이를 멈춰 세운 사람은 대니얼이다. 숨이 넘어가 쓰러진 샘의 얼굴을 감싼 대니얼은 자기와 같은 불기침이라며 품에서 꺼낸 약을 먹이고, 애나는 처음 보는 얼굴이 이상하게 낯익다. 숨이 돌아온 샘은 꿈에서 본 아빠랑 똑같다며 대니얼에게 안겨 아빠라고 부른다. 브록이 네가 정말 이 꼬맹이의 아비냐고 대들자, 호위가 이분은 왕세자 전하라고 호통친다. 애나가 말을 잇지 못하는 사이 대니얼이 나선다. 「그래, 내가 샘의 아버지다.」 대니얼의 눈이 금빛으로 번뜩이고, 내 아들을 또 건드리면 둘 다 지하 감옥에 처넣겠다는 말에 프랭크와 브록은 달아난다.</w:t>
       </w:r>
     </w:p>
     <w:p>
@@ -6273,7 +6274,7 @@
           <w:b w:val="0"/>
           <w:sz w:val="21"/>
         </w:rPr>
-        <w:t>애나는 샘에게 이분은 아빠가 아니라 우리를 구해 준 분이라고 타이른 뒤, 대니얼에게 무엇이든 시켜 달라고 고개를 숙인다. 대니얼은 우리 전에 만난 적이 있느냐고 묻고, 애나는 없다고 답한다. 두 사람 다 6년 전 눈보라 속 그 밤의 상대가 서로라는 걸 알아보지 못한다. 대니얼에게는 크리스마스이브 만찬에 손주를 데려가겠다고 아버지인 국왕과 한 약속이 걸려 있고, 대니얼 눈에 이 아이는 낯이 익다. 「내 계약 연인이 되어 주시오. 샘은 내 아들 노릇을 하고.」</w:t>
+        <w:t>애나는 샘에게 이분은 아빠가 아니라 우리를 구해 준 분이라고 타이른 뒤, 대니얼에게 무엇이든 시켜 달라고 고개를 숙인다. 대니얼은 우리 전에 만난 적이 있느냐고 묻고, 애나는 없다고 답한다. 두 사람 다 6년 전 겨울비 속 그 밤의 상대가 서로인 줄 모른다. 대니얼에게는 아버지인 국왕의 생일 연회에 손주를 데려가겠다는 약속이 걸려 있고, 대니얼 눈에 샘은 낯이 익다. 「내 계약 연인이 되어 주시오. 샘은 내 아들 노릇을 하고.」</w:t>
       </w:r>
     </w:p>
     <w:p>
@@ -6302,7 +6303,7 @@
           <w:b w:val="0"/>
           <w:sz w:val="21"/>
         </w:rPr>
-        <w:t>애나가 대답을 못 하는 사이 샘은 애나의 허리에 매달려, 전하가 준 약을 먹으니 안 아프다며 전하를 도와 달라고 조른다. 대니얼은 천식이 집안 내력이라며 아이 아버지가 누구냐고 묻고, 애나는 샘이 상처받을까 봐 기억도 안 난다고 둘러댄다. 그 집안 내력을 샘이 물려받았다는 걸 두 사람만 모른다. 아버지를 안심시켜 주면 샘에게 평생 이 약을 대 주겠다는 말에 애나는 계약을 받아들인다. 드레스를 입은 애나에게서 대니얼이 눈을 못 뗀다고 샘이 놀리자, 대니얼은 샘에게 이제부터 아빠라고 부르라고 한다. 처음으로 아빠 소리를 들은 대니얼은 왜 이렇게 행복한지 모른 채 샘의 손을 꼭 쥔다.</w:t>
+        <w:t>애나가 대답을 못 하는 사이 샘은 애나의 허리에 매달려, 전하가 준 약을 먹으니 안 아프다며 전하를 도와 달라고 조른다. 대니얼은 불기침이 집안 내력이라며 아이 아버지가 누구냐고 묻고, 애나는 기억도 안 난다고 둘러댄다. 그 내력을 샘이 물려받았다는 걸 두 사람만 모른다. 샘에게 평생 이 약을 대 주겠다는 말에 애나는 계약을 받아들인다. 드레스를 입은 애나에게서 대니얼이 눈을 못 뗀다고 샘이 놀리자, 대니얼은 이제부터 아빠라고 부르라고 한다. 아빠 소리를 들은 대니얼은 왜 이렇게 행복한지 모른 채 샘의 손을 꼭 쥔다. 「우린 최고의 팀이 되겠구나.」 「그럼요, 아빠!」</w:t>
       </w:r>
     </w:p>
     <w:p>
@@ -6345,7 +6346,7 @@
           <w:b w:val="0"/>
           <w:sz w:val="21"/>
         </w:rPr>
-        <w:t>제럴드가 저 아이에겐 왕실 피가 한 방울도 없을지 모른다고 끼어들자, 국왕은 대니얼의 어릴 적 초상화를 가져오라고 한다. 대니얼이 샘에게 왜 나랑 닮았냐고 묻는다. 들킬까 봐 겁이 난 샘은 할아버지도 어릴 땐 자기랑 똑같이 생겼을 거라고 웃어넘긴다. 대니얼은 아버지도 안 하는 의심을 형이 하는 건 왕위를 노려서냐고 몰아붙인다. 국왕은 제럴드의 입을 막고는, 이 나라 아가씨를 다 아는데 왜 너는 본 적이 없느냐고 애나에게 묻는다. 애나가 말을 더듬자 대니얼은 애나가 이웃 나라 윈터 가문의 딸이라고 둘러대고, 모니카는 그 가문쯤은 안다며 얼버무린다.</w:t>
+        <w:t>제럴드가 왕실 피가 없는 아이일지 모른다고 끼어들자, 국왕은 대니얼의 어릴 적 초상화를 펼친다. 대니얼은 샘이 왜 자기를 닮았는지 속으로 의아해한다. 국왕이 초상화와 샘을 번갈아 보자 샘은 씩 웃는다. 「잘생긴 애들은 어릴 때 다 비슷하게 생겼대요. 할아버지도 어릴 땐 저랑 똑같이 생기셨을걸요.」 국왕은 껄껄 웃고 애나에게 왜 처음 보는 얼굴이냐고 묻는다. 대니얼이 윈터 가문의 딸이라고 둘러대며 모니카를 본다. 「사교계에 그렇게 밝다면서 그 가문을 모릅니까?」 처음 듣는 이름이지만 모니카는 체면 때문에 큰소리친다. 「알아요! 윈터 가문은 이웃 나라에서 제일 센 가문이죠.」</w:t>
       </w:r>
     </w:p>
     <w:p>
@@ -6359,7 +6360,7 @@
           <w:b w:val="0"/>
           <w:sz w:val="21"/>
         </w:rPr>
-        <w:t>성 안으로 들어가는 길에 샘은 이 일이 끝나면 아빠를 찾으러 가는 거냐고 애나에게 묻는다. 대니얼이 샘의 아버지는 어디 있느냐고 묻자, 애나는 눈물을 참으며 몇 년째 안 돌아오는 떠돌이 상인이라고 지어낸다. 대니얼은 쓸모없는 놈이 처자식을 버려두느냐며, 누군지 밝혀지면 다리를 분질러 버리겠다고 이를 간다. 그놈이 바로 자기라는 걸 모르는 대니얼은 그 순간 귀를 긁는다. 「왜 갑자기 귀가 가렵지? 누가 내 욕이라도 하나?」</w:t>
+        <w:t>성에 들어가며 샘이 이 일이 끝나면 아빠를 찾으러 가냐고 묻는다. 대니얼이 샘의 아버지는 어디 있냐고 묻자, 애나는 눈물을 참으며 몇 년째 안 돌아오는 떠돌이 상인이라고 지어낸다. 대니얼은 쓸모없는 놈이 처자식을 버려두느냐며, 누군지 밝혀지면 다리를 분질러 버리겠다고 이를 간다. 그놈이 바로 자기라는 걸 모르는 대니얼은 그 순간 귀를 긁는다. 「왜 갑자기 귀가 가렵지? 누가 내 욕이라도 하나?」</w:t>
       </w:r>
     </w:p>
     <w:p>
@@ -6388,7 +6389,7 @@
           <w:b w:val="0"/>
           <w:sz w:val="21"/>
         </w:rPr>
-        <w:t>성 안 알현실의 크리스마스트리 아래에는 보물 상자가 가득하고, 국왕은 샘을 무릎에 앉힌 채 할아버지가 주는 크리스마스 선물이니 마음에 드는 걸 뭐든 고르라고 한다. 레오가 왜 쟤만 주느냐고 떼를 쓰고 모니카가 불공평하다고 거들자, 국왕은 레오에게도 고르라고 하고 레오는 금관과 목걸이를 잔뜩 걸고 뛰어다닌다. 하지만 샘은 보물은 잃어버릴까 겁난다며, 할아버지가 오래 끼고 있던 작은 반지 하나만 갖겠다고, 그러면 할아버지가 보고 싶을 때마다 볼 수 있다고 한다. 모니카는 보물을 두고 낡은 반지를 고르는 천하고 멍청한 꼬맹이라며 속으로 비웃는다.</w:t>
+        <w:t>성 안 알현실에는 보물 상자가 가득하고, 국왕은 샘을 무릎에 앉힌 채 할아버지가 주는 첫 선물이니 마음에 드는 걸 뭐든 고르라고 한다. 레오가 왜 쟤만 주느냐고 떼를 쓰고 모니카가 불공평하다고 거들자, 국왕은 레오에게도 고르라고 하고 레오는 금관과 목걸이를 잔뜩 걸고 뛰어다닌다. 하지만 샘은 보물은 잃어버릴까 겁난다며, 할아버지가 오래 끼고 있던 작은 반지 하나만 갖겠다고, 그러면 할아버지가 보고 싶을 때마다 볼 수 있다고 한다. 모니카는 보물을 두고 낡은 반지를 고르는 천하고 멍청한 꼬맹이라며 속으로 비웃는다.</w:t>
       </w:r>
     </w:p>
     <w:p>
@@ -6431,7 +6432,7 @@
           <w:b w:val="0"/>
           <w:sz w:val="21"/>
         </w:rPr>
-        <w:t>샘이 반지를 쥐고 할아버지에게 안기는 사이, 모니카는 친정아버지에게 애나의 정체를 캐 달라는 편지를 보낸다. 제럴드는 크리스마스이브마다 만찬장에 들여오는 신전의 장작불을 진짜 왕실 피만 맨손으로 쥘 수 있다며, 그 불로 샘을 시험하자고 한다. 모니카가 찾아간 신전에서 대사제는 가장 위대한 왕이 될 다섯 살 사내아이가 지금 궁에 있다고 한다. 모니카는 그게 레오라며 웃는다. 그러나 불꽃 속에 떠오른 건 금관을 쓴 샘의 얼굴이다.</w:t>
+        <w:t>샘이 반지를 쥐고 국왕에게 안기는 사이, 모르는 가문을 아는 척한 게 분한 모니카는 친정아버지에게 윈터 가문을 캐 달라는 편지를 보낸다. 제럴드는 신전의 용 불꽃에 왕가 피를 이은 사람은 타지 않고 아닌 사람은 재가 된다며, 연회에 그 불꽃을 가져와 샘을 시험하자고 한다. 모니카가 찾아간 신전에서 대사제는 가장 위대한 왕이 될 다섯 살 사내아이가 궁에 있다고 한다. 모니카는 그게 레오라며 웃는다. 그러나 불꽃 속에 떠오른 건 금관을 쓴 샘의 얼굴이다.</w:t>
       </w:r>
     </w:p>
     <w:p>
@@ -6445,7 +6446,7 @@
           <w:b w:val="0"/>
           <w:sz w:val="21"/>
         </w:rPr>
-        <w:t>만찬 날 밤, 곁에 있겠다며 대니얼이 손을 잡자 애나는 이 남자가 어떤 위험에서든 자기를 구하러 올 것만 같다. 6년 전 눈보라 속에서 이미 애나를 구한 사람이 대니얼이라는 건 둘 다 모른다. 친정 편지를 뜯은 모니카는 애나는 진저브레드 장수, 샘은 구두닦이였다며 입꼬리를 올린다. 샘이 직접 깎은 트리 장식 인형 다섯 개를 내밀며 할아버지 손주를 다섯 더 만들었다고 하자, 국왕은 인형을 트리에 건다. 대니얼은 샘이 자기 아들이라면 좋겠다고, 아버지가 진실을 알면 마음 아파하실까 생각한다. 그 뒤에서 모니카는 편지를 쥔 채 불이 오기만 기다린다.</w:t>
+        <w:t>생일 연회 날 밤, 곁에 있겠다며 대니얼이 손을 잡자 애나는 이 남자라면 어떤 위험에서든 자기를 구하러 올 것 같다. 6년 전 겨울비 속에서 이미 애나를 구한 사람이 대니얼이라는 건 둘 다 모른다. 친정 편지를 뜯은 모니카는 애나는 빵 장수, 샘은 구두닦이였다며 입꼬리를 올린다. 샘이 깎은 나무 인형 다섯 개를 내밀며 손주를 다섯 더 만들었다고 하자, 국왕은 크게 웃는다. 대니얼은 샘이 자기 아들이라면 좋겠다고, 아버지가 진실을 알면 마음 아파하실까 생각한다. 그 뒤에서 모니카는 편지를 쥔 채 용 불꽃이 오기만 기다린다.</w:t>
       </w:r>
     </w:p>
     <w:p>
@@ -6474,7 +6475,7 @@
           <w:b w:val="0"/>
           <w:sz w:val="21"/>
         </w:rPr>
-        <w:t>이웃 나라 사절을 맞으러 가며 국왕은 샘에게 엄마랑 먼저 먹으라고 한다. 늘 팔다 남은 진저브레드 부스러기와 수프만 먹던 샘과 애나는 트리 아래 바닥에 앉아 고기를 뜯고, 레오는 둘이 개처럼 먹는다고 비웃는다. 레오가 은쟁반으로 샘의 목걸이를 쳐서 반지가 바닥을 구르자, 샘은 엎드려 반지를 움켜쥐며 아빠가 준 반지라고 소리친다. 레오가 강아지에게 바닥 음식을 먹이며 강아지도 쟤네처럼 먹는다고 웃자, 귀족들도 웃는다. 애나는 좋은 삶을 못 줘서 샘이 창피를 당한다며 샘을 끌어안고 운다.</w:t>
+        <w:t>이웃 나라 사절을 맞으러 가며 국왕은 샘에게 엄마랑 먼저 먹으라고 한다. 늘 팔다 남은 빵만 먹던 샘과 애나는 기둥 옆 바닥에 앉아 고기를 손으로 뜯고, 레오는 둘이 개처럼 먹는다고 비웃는다. 레오가 은쟁반으로 샘의 목걸이를 쳐서 반지가 구르자, 샘은 엎드려 반지를 움켜쥐며 아빠가 준 반지라고 소리친다. 레오가 강아지에게 바닥 음식을 먹이며 쟤네처럼 먹는다고 웃자, 귀족들도 웃는다. 애나는 좋은 삶을 못 줘서 샘이 창피를 당한다며 샘을 끌어안고 운다.</w:t>
       </w:r>
     </w:p>
     <w:p>
@@ -6488,7 +6489,7 @@
           <w:b w:val="0"/>
           <w:sz w:val="21"/>
         </w:rPr>
-        <w:t>그때 들어온 대니얼이 애나의 뺨을 감싼다. 「누구도 내 가족을 비웃게 두지 않겠다.」 대니얼은 가족과 함께라면 바닥에서 먹어도 맛있다며 애나 옆에 앉고, 국왕에게도 빵을 내민다. 제럴드가 아버지는 그런 천한 짓 안 하신다고 소리치지만, 국왕은 기꺼이 바닥에 앉아 빵을 뜯으며, 겨울 전선에서 병사들과 눈밭에 앉아 언 빵을 나눠 먹던 시절을 잊었느냐고 꾸짖고, 대니얼이 이 나라를 이끌 거라고 하자, 귀족들은 빵을 들고 대니얼 왕자 만세를 외친다. 그 함성 속에서 모니카는 편지를 꽉 움켜쥔다.</w:t>
+        <w:t>그때 국왕과 들어온 대니얼이 애나의 눈물을 닦고 옆 바닥에 털썩 앉는다. 「귀족은 바닥에서 먹으면 안 된다고 누가 정했지?」 「가족이랑 먹으면 뭐든 맛있는 법이야.」 대니얼이 국왕에게도 빵을 내밀자 제럴드가 소리친다. 「아버지는 절대 저런 천한 짓은 안 하신다, 넌—」 국왕이 그 말을 끊고 바닥에 앉아 빵을 받는다. 「기꺼이 먹으마!」 국왕은 전장에선 병사들과 맨바닥에서 빵을 나눠 먹었다며, 대니얼이 이 나라를 이끌 거라고 한다. 귀족들은 빵을 들고 대니얼 왕자 만세를 외친다. 그 함성 속에서 모니카는 편지를 꽉 움켜쥔다.</w:t>
       </w:r>
     </w:p>
     <w:p>
@@ -6517,7 +6518,7 @@
           <w:b w:val="0"/>
           <w:sz w:val="21"/>
         </w:rPr>
-        <w:t>만세 소리가 잦아들자 모니카가 편지를 들고 국왕 앞에 나선다. 모니카는 애나가 진저브레드 장수, 샘은 구두닦이 사생아이며 윈터 가문에는 다 큰 딸이 없다고 한다. 거짓이면 레오와 함께 죽겠다고 맹세한 모니카는, 프랭크와 브록을 불렀고 대사제도 불을 가져온다고 덧붙인다. 국왕이 대니얼에게 샘이 네 아들이냐고 묻는다. 대니얼이 설명하겠다고 입을 떼자, 국왕은 거짓말하는 아들은 필요 없다며 애나와 샘을 지하 감옥에 처넣으라고 한다. 샘이 화내지 말라며 국왕 허리에 매달린다.</w:t>
+        <w:t>만세 소리가 잦아들자 모니카가 편지를 들고 국왕 앞에 나선다. 모니카는 애나가 빵 장수, 샘은 구두닦이 사생아이며 윈터 가문엔 다 큰 딸이 없다고 한다. 거짓이면 레오와 함께 죽겠다고 맹세한 모니카는, 프랭크와 브록을 불렀고 대사제도 용 불꽃을 가져온다고 한다. 국왕이 대니얼에게 샘이 네 아들이냐고 묻는다. 대니얼이 설명하겠다고 입을 떼자, 국왕은 거짓말하는 아들은 필요 없다며 애나와 샘을 지하 감옥에 처넣으라고 한다. 샘이 화내지 말라며 국왕 허리에 매달린다.</w:t>
       </w:r>
     </w:p>
     <w:p>
@@ -6531,7 +6532,7 @@
           <w:b w:val="0"/>
           <w:sz w:val="21"/>
         </w:rPr>
-        <w:t>대사제가 불을 싣고 들어온다. 대니얼은 샘을 살리려고, 샘은 자기 아들이 아니니 불에 넣으면 재가 된다고 털어놓는다. 샘이 진짜 자기 아들이라는 걸 모르는 채다. 국왕은 자기 손을 불에 넣어 멀쩡한 걸 보여 주고는, 근위병들에게 애나를 붙잡고 샘을 끌고 오게 한다. 「저 아이 손을 불에 넣어라. 네가 죽는 걸 똑똑히 지켜보겠다.」 카메라가 불꽃 위로 끌려가는 샘의 작은 손과 그 목에서 흔들리는 반지를 잡는 순간, 애나가 비명을 지른다. 「안 돼, 샘!」</w:t>
+        <w:t>대사제가 용 불꽃 화로를 들고 들어온다. 대니얼은 샘을 살리려고, 샘은 자기 아들이 아니니 불꽃에 넣으면 재가 된다고 털어놓는다. 샘이 대니얼의 친아들인 걸 대니얼도 국왕도 모른다. 국왕은 자기 손이 불꽃에 타지 않는 걸 보여 주고, 근위병들에게 애나를 붙잡고 샘의 손을 불꽃에 넣으라고 한다. 「천한 사생아 녀석, 감히 내 아들의 왕좌를 훔치려 들어? 네가 죽는 걸 똑똑히 지켜봐 주마!」 카메라가 불꽃 위로 끌려가는 샘의 작은 손과 그 목에서 흔들리는 반지를 잡는 순간, 애나가 비명을 지른다. 「안 돼, 샘!」</w:t>
       </w:r>
     </w:p>
     <w:p>
@@ -7016,7 +7017,7 @@
           <w:b w:val="0"/>
           <w:sz w:val="21"/>
         </w:rPr>
-        <w:t>로즈가 대답을 못 하는 사이 찰리는 로즈의 허리에 매달려, 전하가 준 약을 먹으니 안 아프다며 전하를 도와 달라고 조른다. 줄리언은 천식이 집안 내력이라며 아이 아버지가 누구냐고 묻고, 로즈는 찰리가 상처받을까 봐 기억도 안 난다고 둘러댄다. 그 집안 내력을 찰리가 물려받았다는 걸 두 사람만 모른다. 아버지를 안심시켜 주면 찰리에게 평생 이 약을 대 주겠다는 말에 로즈는 계약을 받아들인다. 드레스를 입은 로즈에게서 줄리언이 눈을 못 뗀다고 찰리가 놀리자, 줄리언은 찰리에게 이제부터 아빠라고 부르라고 한다. 처음으로 아빠 소리를 들은 줄리언은 왜 이렇게 행복한지 모른 채 찰리의 손을 쥔다.</w:t>
+        <w:t>로즈가 머뭇거리자 찰리는 엄마 허리에 매달려, 약을 먹으니 안 아프다며 전하를 도와 달라고 조른다. 줄리언은 천식이 집안 내력이라며 아이 아버지가 누구냐고 묻고, 로즈는 찰리가 상처받을까 봐 기억도 안 난다고 둘러댄다. 그 집안 내력을 찰리가 물려받았다는 걸 두 사람만 모른다. 아버지를 안심시켜 주면 찰리에게 평생 약을 대 주겠다는 말에 로즈는 계약을 받아들인다. 드레스를 입은 로즈에게서 줄리언이 눈을 못 뗀다고 찰리가 놀리자, 줄리언은 이제부터 아빠라고 부르라고 한다. 처음 아빠 소리를 들은 줄리언은 왜 이렇게 행복한지 모른 채 찰리의 손을 쥔다. 「우린 최고의 팀이 되겠구나.」 찰리가 외친다. 「그럼요, 아빠!」</w:t>
       </w:r>
     </w:p>
     <w:p>
@@ -7030,7 +7031,7 @@
           <w:b w:val="0"/>
           <w:sz w:val="21"/>
         </w:rPr>
-        <w:t>성문 앞에는 줄리언의 형 그레고리 왕자와 아내 헬렌, 아들 맥스가 기다린다. 그레고리는 국왕에게, 여자에게 눈길도 안 주던 줄리언에게 아들이 생겼을 리 없다고 하고, 헬렌은 가짜 아이일 거라고 거든다. 국왕은 줄리언이 속였다면 왕세자 자리를 빼앗겠다고 말하지만, 찰리가 할아버지라고 부르며 달려와 안기자 찰리를 번쩍 들어 올린다. 「내 손주로구나! 어릴 때 줄리언이랑 똑같이 생겼어!」</w:t>
+        <w:t>성문 앞에는 줄리언의 형 그레고리 왕자와 아내 헬렌, 아들 맥스가 기다린다. 그레고리는 여자에게 눈길도 안 주던 줄리언에게 아들이 생겼을 리 없다고 하고, 헬렌은 가짜 아이일 거라고 거든다. 국왕은 줄리언이 속였다면 왕세자 자리를 빼앗겠다지만, 찰리가 할아버지 하고 달려와 안기자 번쩍 들어 올린다. 「내 손주로구나! 어릴 때 줄리언이랑 똑같이 생겼어!」</w:t>
       </w:r>
     </w:p>
     <w:p>
@@ -7059,7 +7060,7 @@
           <w:b w:val="0"/>
           <w:sz w:val="21"/>
         </w:rPr>
-        <w:t>그레고리가 저 아이에겐 왕실 피가 한 방울도 없을지 모른다고 끼어들자, 국왕은 줄리언의 어릴 적 초상화를 가져오라고 한다. 줄리언이 찰리에게 왜 나랑 닮았냐고 묻는다. 들킬까 봐 겁이 난 찰리는 할아버지도 어릴 땐 자기랑 똑같이 생겼을 거라고 웃어넘긴다. 줄리언은 아버지도 안 하는 의심을 형이 하는 건 왕위를 노려서냐고 몰아붙인다. 국왕은 그레고리의 입을 막고는, 이 나라 아가씨를 다 아는데 왜 너는 본 적이 없느냐고 로즈에게 묻는다. 로즈가 말을 더듬자 줄리언은 로즈가 이웃 나라 그레이 가문의 딸이라고 둘러대고, 헬렌은 그 가문쯤은 안다며 얼버무린다.</w:t>
+        <w:t>그레고리가 저 아이는 왕실 피가 아닐 거라고 끼어들자, 국왕은 줄리언의 어릴 적 초상화를 가져오게 한다. 그림 속 줄리언은 찰리와 똑같다. 줄리언은 왜 이리 닮았는지 속으로 의아해하고, 국왕은 그림과 찰리를 번갈아 본다. 찰리는 겁도 없이 웃는다. 「잘생긴 애들은 어릴 때 다 비슷하게 생겼대요. 할아버지도 어릴 땐 저랑 똑같이 생기셨을걸요.」 줄리언이 왕위가 탐나느냐고 형을 몰아붙이자, 국왕은 그레고리 입을 막고 로즈에게 왜 처음 보는 얼굴이냐고 묻는다. 줄리언은 로즈가 그레이 가문 딸이라며 헬렌을 본다. 「사교계에 그렇게 밝다면서 그 가문을 모릅니까?」 모른다고 하면 체면이 깎이는 헬렌이 답한다. 「알아요! 그레이 가문은 이웃 나라에서 제일 센 가문이죠.」</w:t>
       </w:r>
     </w:p>
     <w:p>
@@ -7073,7 +7074,7 @@
           <w:b w:val="0"/>
           <w:sz w:val="21"/>
         </w:rPr>
-        <w:t>성 안으로 들어가는 길에 찰리는 이 일이 끝나면 아빠를 찾으러 가는 거냐고 로즈에게 묻는다. 줄리언이 찰리의 아버지는 어디 있느냐고 묻자, 로즈는 눈물을 참으며 몇 년째 안 돌아오는 떠돌이 상인이라고 지어낸다. 줄리언은 쓸모없는 놈이 처자식을 버려두느냐며, 누군지 밝혀지면 다리를 분질러 버리겠다고 이를 간다. 그놈이 바로 자기라는 걸 모르는 줄리언은 귀를 긁는다. 「왜 갑자기 귀가 가렵지? 누가 내 욕이라도 하나?」</w:t>
+        <w:t>헬렌까지 안다고 하자 국왕은 더 묻지 않는다. 찰리 아버지를 묻는 줄리언에게 로즈는 몇 년째 안 돌아오는 떠돌이 상인이라고 지어낸다. 줄리언은 처자식 버린 놈이 누군지 밝혀지면 다리를 분질러 버리겠다고 이를 간다. 그놈이 자기라는 걸 모르는 줄리언은 귀를 긁는다. 「왜 갑자기 귀가 가렵지? 누가 내 욕이라도 하나?」</w:t>
       </w:r>
     </w:p>
     <w:p>
@@ -7145,7 +7146,7 @@
           <w:b w:val="0"/>
           <w:sz w:val="21"/>
         </w:rPr>
-        <w:t>찰리가 반지를 쥐고 할아버지에게 안기는 사이, 헬렌은 친정아버지에게 로즈의 정체를 캐 달라는 편지를 보낸다. 그레고리는 신전의 성화는 진짜 왕실 피만 견딜 수 있다며, 생일 연회에 그 불을 가져와 찰리를 시험하자고 한다. 헬렌이 찾아간 신전에서 대사제는 가장 위대한 왕이 될 다섯 살 사내아이가 지금 궁에 있다고 한다. 헬렌은 그게 맥스라며 웃는다. 그러나 성화 속에 떠오른 건 금관을 쓴 찰리의 얼굴이다.</w:t>
+        <w:t>찰리가 반지를 쥐고 할아버지에게 안기는 사이, 줄리언에게 망신당한 헬렌은 그레이 가문에 로즈 같은 딸이 있는지 캐 달라고 친정에 편지를 보낸다. 그레고리는 신전의 성화는 진짜 왕실 피만 견딘다며, 생일 연회에 그 불로 찰리를 시험하자고 한다. 헬렌이 찾아간 신전에서 대사제는 가장 위대한 왕이 될 다섯 살 사내아이가 지금 궁에 있다고 한다. 헬렌은 그게 맥스라며 웃는다. 그러나 성화 속에 떠오른 건 금관을 쓴 찰리의 얼굴이다.</w:t>
       </w:r>
     </w:p>
     <w:p>
@@ -7159,7 +7160,7 @@
           <w:b w:val="0"/>
           <w:sz w:val="21"/>
         </w:rPr>
-        <w:t>생일 연회 날 밤, 곁에 있겠다며 줄리언이 손을 잡자 로즈는 이 남자가 어떤 위험에서든 자기를 구하러 올 것만 같다. 6년 전 빗속에서 이미 로즈를 구한 사람이 줄리언이라는 건 둘 다 모른다. 친정 편지를 뜯은 헬렌은 로즈는 빵 장수, 찰리는 구두닦이였다며 입꼬리를 올린다. 찰리가 직접 깎은 나무 인형 다섯 개를 생일 선물로 내밀며 할아버지 손주를 다섯 더 만들었다고 하자, 국왕은 가르친 적도 없는데 착하다며 크게 웃는다. 줄리언은 찰리가 자기 아들이라면 좋겠다고, 아버지가 진실을 알면 마음 아파하실까 생각한다. 그 뒤에서 헬렌은 편지를 쥔 채 성화가 오기만 기다린다.</w:t>
+        <w:t>생일 연회 날 밤, 곁에 있겠다며 줄리언이 손을 잡자 로즈는 이 남자가 언제든 자기를 구하러 올 것만 같다. 6년 전 빗속에서 이미 로즈를 구한 사람이 줄리언이라는 건 둘 다 모른다. 친정 편지를 뜯은 헬렌은 로즈는 빵 장수, 찰리는 구두닦이였다며 입꼬리를 올린다. 찰리가 직접 깎은 나무 인형 다섯 개를 내밀며 할아버지 손주를 다섯 더 만들었다고 하자, 국왕은 가르친 적도 없는데 착하다며 크게 웃는다. 줄리언은 찰리가 자기 아들이라면 좋겠다고, 아버지가 진실을 알면 마음 아파하실까 생각한다. 그 뒤에서 헬렌은 편지를 쥔 채 성화가 오기만 기다린다.</w:t>
       </w:r>
     </w:p>
     <w:p>
@@ -7188,7 +7189,7 @@
           <w:b w:val="0"/>
           <w:sz w:val="21"/>
         </w:rPr>
-        <w:t>이웃 나라 사절을 맞으러 가며 국왕은 찰리에게 엄마랑 먼저 먹으라고 한다. 늘 팔다 남은 빵과 수프만 먹던 찰리와 로즈는 기둥 옆 바닥에 앉아 고기를 손으로 뜯고, 맥스는 둘이 개처럼 먹는다고 비웃는다. 맥스가 은쟁반으로 찰리의 목걸이를 쳐서 반지가 바닥을 구르자, 찰리는 엎드려 반지를 움켜쥐며 아빠가 준 반지라고 소리친다. 맥스가 강아지에게 바닥 음식을 먹이며 강아지도 쟤네처럼 먹는다고 웃자, 귀족들도 따라 웃는다. 로즈는 좋은 삶을 못 줘서 찰리가 창피를 당한다며 찰리를 끌어안고 운다.</w:t>
+        <w:t>사절을 맞으러 가며 국왕은 찰리에게 엄마랑 먼저 먹으라고 한다. 늘 팔다 남은 빵과 수프만 먹던 찰리와 로즈는 기둥 옆 바닥에 앉아 고기를 손으로 뜯고, 맥스는 둘이 개처럼 먹는다고 비웃는다. 맥스가 은쟁반으로 찰리의 목걸이를 쳐서 반지가 바닥을 구르자, 찰리는 엎드려 반지를 움켜쥐며 아빠가 준 반지라고 소리친다. 맥스가 강아지에게 바닥 음식을 먹이며 쟤네처럼 먹는다고 웃자, 귀족들도 따라 웃는다. 로즈는 자기 탓에 찰리가 창피를 당한다며 찰리를 끌어안고 운다.</w:t>
       </w:r>
     </w:p>
     <w:p>
@@ -7202,7 +7203,7 @@
           <w:b w:val="0"/>
           <w:sz w:val="21"/>
         </w:rPr>
-        <w:t>그때 들어온 줄리언이 로즈의 뺨을 감싼다. 「누구도 내 가족을 비웃게 두지 않겠다.」 줄리언은 가족과 함께라면 바닥에서 먹어도 맛있다며 로즈 옆에 앉고, 국왕에게도 빵을 내민다. 그레고리가 아버지는 그런 천한 짓 안 하신다고 소리치지만, 국왕은 기꺼이 바닥에 앉아 빵을 뜯으며, 전장에서 병사들과 맨바닥에 앉아 빵을 나눠 먹던 시절을 잊었느냐고 꾸짖고, 줄리언이 이 나라를 이끌 거라고 하자, 귀족들은 빵을 들고 줄리언 왕자 만세를 외친다. 그 함성 속에서 헬렌은 편지를 꽉 움켜쥔다.</w:t>
+        <w:t>그때 들어온 줄리언이 로즈 옆 바닥에 앉는다. 「귀족은 바닥에서 먹으면 안 된다고 누가 정했지? 가족이랑 먹으면 뭐든 맛있는 법이야.」 줄리언이 돌아온 국왕에게도 빵을 내밀자 그레고리가 소리친다. 「아버지는 절대 저런 천한 짓은 안 하신다, 넌—」 국왕이 그 말을 끊고 바닥에 앉는다. 「기꺼이 먹으마!」 국왕은 전장에서 병사들과 맨바닥에서 먹던 시절을 잊었느냐고 귀족들을 꾸짖는다. 줄리언이 이 나라를 이끌 거라는 말에 귀족들은 빵을 들고 줄리언 왕자 만세를 외친다. 그 함성 속에서 헬렌은 편지를 꽉 움켜쥔다.</w:t>
       </w:r>
     </w:p>
     <w:p>
@@ -7231,7 +7232,7 @@
           <w:b w:val="0"/>
           <w:sz w:val="21"/>
         </w:rPr>
-        <w:t>만세 소리가 잦아들자 헬렌이 편지를 들고 국왕 앞에 나선다. 헬렌은 로즈가 빵 장수, 찰리는 구두닦이 사생아이며 그레이 가문에는 다 큰 딸이 없다고 한다. 거짓이면 맥스와 함께 죽겠다고 맹세한 헬렌은, 로즈를 팔아넘긴 칼과 웨이드와 릭까지 증인으로 불렀고 대사제도 성화를 가져온다고 덧붙인다. 국왕이 줄리언에게 찰리가 네 아들이냐고 묻는다. 줄리언이 설명하겠다고 입을 떼자, 국왕은 거짓말하는 아들은 필요 없다며 로즈와 찰리를 지하 감옥에 처넣으라고 한다. 찰리가 화내지 말라며 국왕 허리에 매달린다.</w:t>
+        <w:t>만세 소리가 잦아들자 헬렌이 편지를 들고 국왕 앞에 나선다. 헬렌은 로즈가 빵 장수, 찰리는 구두닦이 사생아이며 그레이 가문에는 다 큰 딸이 없다고 한다. 거짓이면 맥스와 함께 죽겠다고 맹세한 헬렌은, 로즈를 팔아넘긴 칼과 웨이드와 릭을 증인으로 불렀고 대사제도 성화를 가져온다고 덧붙인다. 찰리가 네 아들이냐는 국왕의 물음에 줄리언이 설명하겠다고 입을 떼자, 국왕은 거짓말하는 아들은 필요 없다며 로즈와 찰리를 지하 감옥에 처넣으라고 한다. 찰리가 화내지 말라며 국왕 허리에 매달린다.</w:t>
       </w:r>
     </w:p>
     <w:p>
@@ -7245,7 +7246,7 @@
           <w:b w:val="0"/>
           <w:sz w:val="21"/>
         </w:rPr>
-        <w:t>대사제가 성화를 싣고 들어온다. 줄리언은 찰리를 살리려고, 찰리는 자기 아들이 아니니 불에 넣으면 재가 된다고 털어놓는다. 찰리가 진짜 자기 아들이라는 걸 모르는 채다. 국왕은 자기 손을 성화에 넣어 멀쩡한 걸 보여 주고는, 근위병들에게 로즈를 붙잡고 찰리를 끌고 오게 한다. 「저 아이 손을 성화에 넣어라. 네가 죽는 걸 똑똑히 지켜보겠다.」 카메라가 불꽃 위로 끌려가는 찰리의 작은 손과 그 목에서 흔들리는 반지를 잡는 순간, 로즈가 비명을 지른다. 「안 돼, 찰리!」</w:t>
+        <w:t>대사제가 성화를 들고 온다. 줄리언은 찰리를 살리려고, 찰리는 자기 아들이 아니니 불에 넣으면 재가 된다고 털어놓는다. 찰리가 진짜 자기 아들이라는 걸 모르는 채다. 국왕은 자기 손을 성화에 넣어 멀쩡한 걸 보이고는, 친손자인 줄 모르는 찰리의 손도 넣으라고 명령한다. 「천한 사생아 녀석, 감히 내 아들의 왕좌를 훔치려 들어? 네가 죽는 걸 똑똑히 지켜봐 주마!」 카메라가 불꽃 위로 끌려가는 찰리의 작은 손과 그 목에서 흔들리는 반지를 잡는 순간, 로즈가 비명을 지른다. 「안 돼, 찰리!」</w:t>
       </w:r>
     </w:p>
     <w:p>

</xml_diff>

<commit_message>
Auto commit (2026-10-06 18:51) — 4 changes
Claude Code 세션 종료 시 자동 커밋.

Co-Authored-By: Claude <noreply@anthropic.com>
</commit_message>
<xml_diff>
--- a/projects/리메이크 러프 기획안 11종_v2.docx
+++ b/projects/리메이크 러프 기획안 11종_v2.docx
@@ -4075,7 +4075,7 @@
           <w:b w:val="0"/>
           <w:sz w:val="21"/>
         </w:rPr>
-        <w:t>헨리가 다가서자 올리가 또 자지러지게 운다. 「형한테서 이상한 냄새 나. 건초에서 굴렀어?」 케이티가 냄새 밴 외투를 벗으라고 하자 헨리는 1년 치 방세보다 비싼 외투라고 비웃다가, 아기 코는 어른보다 예민하다는 말에 외투를 벽난로에 던지게 한다. 외투가 타자 올리는 형 품에서 처음 울음을 그친다. 목숨 걸고 왕족 일을 하니 돈도 왕실답게 달라는 케이티에게 헨리가 답한다. 「나한테 조건 거는 사람은 없다.」 「그럼 하루만 줘요.」 헨리는 그 하루에 은화 만 닢을 걸고, 올리가 안 나으면 케이티도 마거릿도 궁을 떠나라고 한다. 젖병을 든 케이티 손이, 이거 먹으면 배에서 전쟁 난다는 올리 말에 멈춘다. 「잠깐만요. 이 사슴젖, 뭔가 이상해요.」</w:t>
+        <w:t>헨리가 다가서자 올리가 또 자지러지게 운다. 「형한테서 이상한 냄새 나. 건초에서 굴렀어?」 케이티가 냄새 밴 외투를 벗으라고 하자 헨리는 1년 치 방세보다 비싼 외투라고 비웃다가, 아기 코는 어른보다 예민하다는 말에 외투를 벽난로에 던지게 한다. 외투가 타자 올리는 형 품에서 처음 울음을 그친다. 목숨 걸고 왕족 일을 하니 돈도 왕실답게 달라는 케이티에게 헨리가 답한다. 「나한테 조건 거는 사람은 없다.」 「그럼 하루만 줘요.」 헨리는 그 하루에 은화 만 닢을 걸고, 올리가 안 나으면 케이티도 마거릿도 궁을 떠나라고 한다. 케이티가 젖병을 들다, 이거 먹으면 배에서 전쟁 난다는 올리 말에 멈춘다. 「잠깐만요. 이 사슴젖, 뭔가 이상해요.」</w:t>
       </w:r>
     </w:p>
     <w:p>
@@ -4104,7 +4104,7 @@
           <w:b w:val="0"/>
           <w:sz w:val="21"/>
         </w:rPr>
-        <w:t>왕실 의원은 왕가가 대대로 먹여 온 눈사슴 젖에 토를 다느냐고 펄쩍 뛴다. 「내 일은 애한테 젖을 먹이는 거지, 젖의 왕실 명예를 지키는 게 아니에요.」 단 젖은 나쁜 놈이라는 올리 말대로, 사슴젖만 먹으면 올리 배가 부풀고 두드러기가 나는데 마거릿은 42일은 참으라며 먹여 왔다. 케이티가 올리 팔뚝 두 곳에 사슴젖과 당나귀 젖을 한 방울씩 떨어뜨리자, 가려운 올리가 불을 뿜어 아기 침대가 불탄다. 불길 속에서도 케이티는 올리 팔을 놓지 않고, 두드러기는 사슴젖 자리에만 돋는다. 석 달 동안 어떤 의원도 못 잡아낸 알레르기다.</w:t>
+        <w:t>왕실 의원은 왕가 대대로 먹여 온 눈사슴 젖에 토를 다느냐고 펄쩍 뛰고, 케이티가 받아친다. 「내 일은 애한테 젖을 먹이는 거지, 젖의 왕실 명예를 지키는 게 아니에요.」 단 젖은 나쁜 놈이라는 올리 말대로, 사슴젖만 먹으면 배가 부풀고 두드러기가 나는데 마거릿은 42일은 참으라며 먹여 왔다. 케이티가 올리 팔뚝 두 곳에 사슴젖과 당나귀 젖을 한 방울씩 떨어뜨리자, 가려운 올리가 불을 뿜어 아기 침대가 불탄다. 불길 속에서도 케이티는 올리 팔을 놓지 않고, 두드러기는 사슴젖 자리에만 돋는다. 석 달 동안 어떤 의원도 못 잡아낸 알레르기다.</w:t>
       </w:r>
     </w:p>
     <w:p>
@@ -4118,7 +4118,7 @@
           <w:b w:val="0"/>
           <w:sz w:val="21"/>
         </w:rPr>
-        <w:t>당나귀 젖을 다 비운 올리 곁에서 헨리가 왜 불길 속에서 손을 안 뺐냐고 묻자, 케이티는 무서웠다고, 돈도 아직 못 받았지만 돈이 없어도 했을 거라고 답한다. 첫 시험에 붙자 마거릿은 사흘 뒤 동지 연회에서 인간이 후계자를 안으면 웃음거리라고 막아서지만, 헨리는 누구든 올리에게 젖병 하나를 비우게 하면 그때 웃으라고 한다. 불 없이 재우면 은화 천 닢을 더 준다는 말에, 케이티는 올리를 들어 올리고 손가락을 세운다. 「침대 또 태우면 값 올린다.」</w:t>
+        <w:t>당나귀 젖을 다 비운 올리 곁에서 헨리가 왜 불길 속에서 손을 안 뺐냐고 묻자, 케이티는 무서웠다고, 돈도 아직 못 받았지만 돈이 없어도 했을 거라고 답한다. 첫 시험에 붙자 마거릿은 사흘 뒤 동지 연회에서 인간이 후계자를 안으면 웃음거리라고 막아서지만, 헨리는 누구든 올리에게 젖병 하나 비우게 하면 그때 웃으라고 한다. 불 없이 재우면 은화 천 닢을 더 준다는 말에, 케이티는 올리에게 손가락을 세운다. 「침대 또 태우면 값 올린다.」</w:t>
       </w:r>
     </w:p>
     <w:p>
@@ -4233,7 +4233,7 @@
           <w:b w:val="0"/>
           <w:sz w:val="21"/>
         </w:rPr>
-        <w:t>마거릿의 말에 헨리는 궁 문을 모두 얼려 막고, 올리가 죽으면 오늘 올리에게 손댄 사람은 전부 쇠사슬에 묶인다고 한다. 루스는 케이티를 지하 얼음 창고에 가두라고 하고, 왕실 의원은 숨이 끊겼다고 선언한다. 끌려가던 케이티에게 올리의 희미한 목소리가 들린다. 「맛없어. 걸렸어.」 케이티가 살아 있다고 소리치자, 루스는 실패하면 자기 손으로 케이티의 목을 치겠다며 기회를 준다.</w:t>
+        <w:t>마거릿의 말에 헨리는 궁 문을 모두 얼려 막고, 올리가 죽으면 손댄 사람은 전부 쇠사슬에 묶인다고 한다. 루스는 케이티를 얼음 창고에 가두라고 하고, 왕실 의원은 숨이 끊겼다고 선언한다. 끌려가던 케이티에게 올리의 희미한 목소리가 들린다. 「맛없어. 걸렸어.」 케이티가 살아 있다고 소리치자, 루스는 실패하면 자기 손으로 목을 치겠다며 기회를 준다.</w:t>
       </w:r>
     </w:p>
     <w:p>
@@ -4247,7 +4247,7 @@
           <w:b w:val="0"/>
           <w:sz w:val="21"/>
         </w:rPr>
-        <w:t>케이티가 올리를 팔뚝에 엎드려 눕혀 등을 두드리며 밀어내라고 하자, 헨리는 아기가 어떻게 알아듣냐고 한다. 「얘는 알아들어요. 못 알아듣는 건 당신이에요.」 명령이니 돌아오라는 헨리에게 케이티가 소리친다. 「명령 말고 이름을 불러요!」 「올리, 형이야. 돌아와.」 그 순간 올리 목에서 은방울이 튀어나오고, 목에 막혀 있던 불길이 한꺼번에 터져 상록수까지 치솟으며 올리를 감싼 케이티를 덮친다. 첫날 손대면 목이 날아간다던 그 왕자를 케이티는 끝까지 품에 안은 채다. 카메라는 불길 속을 비추지 않고, 저 불이면 얼음 용도 녹는다며 케이티가 죽었다고 중얼거리던 헨리가 소리친다. 「케이티, 대답해!」</w:t>
+        <w:t>케이티가 올리를 팔뚝에 엎드려 눕혀 등을 두드리며 밀어내라고 하자, 헨리는 아기가 어떻게 알아듣냐고 하고, 케이티가 쏘아붙인다. 「얘는 알아들어요. 못 알아듣는 건 당신이에요.」 명령이니 돌아오라는 헨리에게 케이티가 소리친다. 「명령 말고 이름을 불러요!」 헨리가 이름을 부른다. 「올리, 형이야. 돌아와.」 그 순간 올리 목에서 은방울이 튀어나오고, 막혀 있던 불길이 터져 상록수까지 치솟으며 올리를 감싼 케이티를 덮친다. 첫날 손대면 목이 날아간다던 그 왕자를 케이티는 끝까지 품에 안은 채다. 카메라는 불길 속을 비추지 않고, 저 불이면 얼음 용도 녹는다며 케이티가 죽었다고 중얼거리던 헨리가 소리친다. 「케이티, 대답해!」</w:t>
       </w:r>
     </w:p>
     <w:p>
@@ -6403,7 +6403,7 @@
           <w:b w:val="0"/>
           <w:sz w:val="21"/>
         </w:rPr>
-        <w:t>국왕은 샘의 할머니가 손수 만들어 준 결혼반지라며, 30년 동안 한 번도 빼지 않은 그 반지를 빼서 샘의 손에 쥐여 준다. 그걸 본 제럴드의 얼굴이 굳는다. 그 반지는 원래 다음 왕위를 이을 아이에게 가는 반지다. 반지가 정말로 왕세자의 아들 손에 들어갔다는 걸 국왕도 제럴드도 모른다. 「어디서 굴러온 근본 없는 놈한테 저걸 주다니. 우리 레오는 어떻게 되는 거야.」</w:t>
+        <w:t>국왕은 샘의 할머니가 손수 만들어 준 결혼반지라며, 30년 동안 한 번도 빼지 않은 그 반지를 빼서 샘의 손에 쥐여 준다. 그걸 본 제럴드의 얼굴이 굳는다. 그 반지는 원래 다음 왕위를 이을 아이에게 가는 반지다. 반지가 정말로 왕세자의 아들 손에 들어갔다는 걸 국왕도 제럴드도 모른다. 모니카가 이를 간다. 「어디서 굴러온 근본 없는 놈한테 저걸 주다니. 우리 레오는 어떻게 되는 거야.」</w:t>
       </w:r>
     </w:p>
     <w:p>
@@ -7117,7 +7117,7 @@
           <w:b w:val="0"/>
           <w:sz w:val="21"/>
         </w:rPr>
-        <w:t>국왕은 찰리의 할머니가 손수 만들어 준 결혼반지라며, 30년 동안 한 번도 빼지 않은 그 반지를 빼서 찰리의 손에 쥐여 준다. 그걸 본 그레고리의 얼굴이 굳는다. 그 반지는 원래 다음 왕위를 이을 아이에게 가는 반지다. 반지가 정말로 왕세자의 아들 손에 들어갔다는 걸 국왕도 그레고리도 모른다. 「어디서 굴러온 근본 없는 놈한테 저걸 주다니. 우리 맥스는 어떻게 되는 거야.」</w:t>
+        <w:t>국왕은 찰리의 할머니가 손수 만들어 준 결혼반지라며, 30년 동안 한 번도 빼지 않은 그 반지를 빼서 찰리의 손에 쥐여 준다. 그걸 본 그레고리의 얼굴이 굳는다. 그 반지는 원래 다음 왕위를 이을 아이에게 가는 반지다. 반지가 정말로 왕세자의 아들 손에 들어갔다는 걸 국왕도 그레고리도 모른다. 헬렌가 이를 간다. 「어디서 굴러온 근본 없는 놈한테 저걸 주다니. 우리 맥스는 어떻게 되는 거야.」</w:t>
       </w:r>
     </w:p>
     <w:p>

</xml_diff>